<commit_message>
Update notes doc with CKA and LRP, add LRP entry
</commit_message>
<xml_diff>
--- a/Σημειώσεις-DL-πειράματα-άρθρου2.docx
+++ b/Σημειώσεις-DL-πειράματα-άρθρου2.docx
@@ -10995,8 +10995,447 @@
         <w:pStyle w:val="Heading1"/>
       </w:pPr>
       <w:r>
-        <w:t xml:space="preserve">Περιορισμοί που πρέπει να αναφέρω</w:t>
+        <w:t xml:space="preserve">Ανάλυση αναπαραστάσεων με CKA</w:t>
       </w:r>
+    </w:p>
+    <w:p>
+      <w:pPr>
+        <w:spacing w:after="120"/>
+      </w:pPr>
+      <w:r>
+        <w:t xml:space="preserve">Ο επιβλέπων ζήτησε επιπλέον τεχνικές XAI. Η πρώτη είναι το CKA (Centered Kernel Alignment, Kornblith et al., ICML 2019), που μετράει πόσο μοιάζουν δύο αναπαραστάσεις των ίδιων δειγμάτων: 0 σημαίνει καμία ομοιότητα και 1 ίδια γεωμετρία. Δουλεύει και όταν οι δύο αναπαραστάσεις έχουν διαφορετικό πλήθος νευρώνων. Το CKA δεν εξηγεί προβλέψεις όπως το SHAP. Αναλύει το εσωτερικό των μοντέλων, δηλαδή τι αναπαράσταση φτιάχνει κάθε στρώμα.</w:t>
+      </w:r>
+    </w:p>
+    <w:p>
+      <w:pPr>
+        <w:spacing w:after="120"/>
+      </w:pPr>
+      <w:r>
+        <w:t xml:space="preserve">Εφαρμόστηκε στα μοντέλα που έχουν στρώματα: MLP (με ένα και με δύο κρυφά στρώματα), Autoencoder (bottleneck και έξοδος) και TabNet (δύο βήματα attention). Δεν εφαρμόζεται στα kNN, SVM, Logistic Regression, RUSBoost και GRNN. Χρησιμοποιήθηκε το γραμμικό CKA (script cka_analysis.py), πάνω σε όλα τα δείγματα των δύο datasets (116 και 569), χωρίς τις ετικέτες. Τα μοντέλα εκπαιδεύτηκαν μόνο στα δεδομένα train. Στο TabNet το early stopping έγινε σε ξεχωριστό 20% των δεδομένων train και όχι στο test. Έλεγχος ορθότητας του εργαλείου: CKA(X, X) = 1,000, CKA μετά από περιστροφή και αλλαγή κλίμακας = 1,000, CKA με τυχαίο θόρυβο 0,057 (Coimbra) και 0,013 (WDBC).</w:t>
+      </w:r>
+    </w:p>
+    <w:p>
+      <w:pPr>
+        <w:spacing w:after="120"/>
+      </w:pPr>
+      <w:r>
+        <w:t xml:space="preserve">Κλίμακα αναφοράς: εκπαίδευσα το ίδιο MLP με 4 διαφορετικά seeds και υπολόγισα το CKA του κρυφού στρώματος μεταξύ τους.</w:t>
+      </w:r>
+    </w:p>
+    <w:tbl>
+      <w:tblPr>
+        <w:tblW w:type="dxa" w:w="9026"/>
+        <w:tblBorders>
+          <w:top w:val="single" w:color="auto" w:sz="4"/>
+          <w:left w:val="single" w:color="auto" w:sz="4"/>
+          <w:bottom w:val="single" w:color="auto" w:sz="4"/>
+          <w:right w:val="single" w:color="auto" w:sz="4"/>
+          <w:insideH w:val="single" w:color="auto" w:sz="4"/>
+          <w:insideV w:val="single" w:color="auto" w:sz="4"/>
+        </w:tblBorders>
+      </w:tblPr>
+      <w:tblGrid>
+        <w:gridCol w:w="3026"/>
+        <w:gridCol w:w="2000"/>
+        <w:gridCol w:w="2000"/>
+        <w:gridCol w:w="2000"/>
+      </w:tblGrid>
+      <w:tr>
+        <w:trPr>
+          <w:tblHeader/>
+        </w:trPr>
+        <w:tc>
+          <w:tcPr>
+            <w:tcW w:type="dxa" w:w="3026"/>
+            <w:tcBorders>
+              <w:top w:val="single" w:color="A6A6A6" w:sz="4"/>
+              <w:left w:val="single" w:color="A6A6A6" w:sz="4"/>
+              <w:bottom w:val="single" w:color="A6A6A6" w:sz="4"/>
+              <w:right w:val="single" w:color="A6A6A6" w:sz="4"/>
+            </w:tcBorders>
+            <w:shd w:fill="DCE9F1" w:color="auto" w:val="clear"/>
+            <w:tcMar>
+              <w:top w:type="dxa" w:w="60"/>
+              <w:left w:type="dxa" w:w="100"/>
+              <w:bottom w:type="dxa" w:w="60"/>
+              <w:right w:type="dxa" w:w="100"/>
+            </w:tcMar>
+          </w:tcPr>
+          <w:p>
+            <w:pPr>
+              <w:keepNext/>
+            </w:pPr>
+            <w:r>
+              <w:rPr>
+                <w:b/>
+                <w:bCs/>
+                <w:sz w:val="20"/>
+                <w:szCs w:val="20"/>
+              </w:rPr>
+              <w:t xml:space="preserve">Dataset</w:t>
+            </w:r>
+          </w:p>
+        </w:tc>
+        <w:tc>
+          <w:tcPr>
+            <w:tcW w:type="dxa" w:w="2000"/>
+            <w:tcBorders>
+              <w:top w:val="single" w:color="A6A6A6" w:sz="4"/>
+              <w:left w:val="single" w:color="A6A6A6" w:sz="4"/>
+              <w:bottom w:val="single" w:color="A6A6A6" w:sz="4"/>
+              <w:right w:val="single" w:color="A6A6A6" w:sz="4"/>
+            </w:tcBorders>
+            <w:shd w:fill="DCE9F1" w:color="auto" w:val="clear"/>
+            <w:tcMar>
+              <w:top w:type="dxa" w:w="60"/>
+              <w:left w:type="dxa" w:w="100"/>
+              <w:bottom w:type="dxa" w:w="60"/>
+              <w:right w:type="dxa" w:w="100"/>
+            </w:tcMar>
+          </w:tcPr>
+          <w:p>
+            <w:pPr>
+              <w:keepNext/>
+            </w:pPr>
+            <w:r>
+              <w:rPr>
+                <w:b/>
+                <w:bCs/>
+                <w:sz w:val="20"/>
+                <w:szCs w:val="20"/>
+              </w:rPr>
+              <w:t xml:space="preserve">Μέσος όρος</w:t>
+            </w:r>
+          </w:p>
+        </w:tc>
+        <w:tc>
+          <w:tcPr>
+            <w:tcW w:type="dxa" w:w="2000"/>
+            <w:tcBorders>
+              <w:top w:val="single" w:color="A6A6A6" w:sz="4"/>
+              <w:left w:val="single" w:color="A6A6A6" w:sz="4"/>
+              <w:bottom w:val="single" w:color="A6A6A6" w:sz="4"/>
+              <w:right w:val="single" w:color="A6A6A6" w:sz="4"/>
+            </w:tcBorders>
+            <w:shd w:fill="DCE9F1" w:color="auto" w:val="clear"/>
+            <w:tcMar>
+              <w:top w:type="dxa" w:w="60"/>
+              <w:left w:type="dxa" w:w="100"/>
+              <w:bottom w:type="dxa" w:w="60"/>
+              <w:right w:type="dxa" w:w="100"/>
+            </w:tcMar>
+          </w:tcPr>
+          <w:p>
+            <w:pPr>
+              <w:keepNext/>
+            </w:pPr>
+            <w:r>
+              <w:rPr>
+                <w:b/>
+                <w:bCs/>
+                <w:sz w:val="20"/>
+                <w:szCs w:val="20"/>
+              </w:rPr>
+              <w:t xml:space="preserve">Ελάχιστο</w:t>
+            </w:r>
+          </w:p>
+        </w:tc>
+        <w:tc>
+          <w:tcPr>
+            <w:tcW w:type="dxa" w:w="2000"/>
+            <w:tcBorders>
+              <w:top w:val="single" w:color="A6A6A6" w:sz="4"/>
+              <w:left w:val="single" w:color="A6A6A6" w:sz="4"/>
+              <w:bottom w:val="single" w:color="A6A6A6" w:sz="4"/>
+              <w:right w:val="single" w:color="A6A6A6" w:sz="4"/>
+            </w:tcBorders>
+            <w:shd w:fill="DCE9F1" w:color="auto" w:val="clear"/>
+            <w:tcMar>
+              <w:top w:type="dxa" w:w="60"/>
+              <w:left w:type="dxa" w:w="100"/>
+              <w:bottom w:type="dxa" w:w="60"/>
+              <w:right w:type="dxa" w:w="100"/>
+            </w:tcMar>
+          </w:tcPr>
+          <w:p>
+            <w:pPr>
+              <w:keepNext/>
+            </w:pPr>
+            <w:r>
+              <w:rPr>
+                <w:b/>
+                <w:bCs/>
+                <w:sz w:val="20"/>
+                <w:szCs w:val="20"/>
+              </w:rPr>
+              <w:t xml:space="preserve">Μέγιστο</w:t>
+            </w:r>
+          </w:p>
+        </w:tc>
+      </w:tr>
+      <w:tr>
+        <w:trPr>
+          <w:cantSplit/>
+        </w:trPr>
+        <w:tc>
+          <w:tcPr>
+            <w:tcW w:type="dxa" w:w="3026"/>
+            <w:tcBorders>
+              <w:top w:val="single" w:color="A6A6A6" w:sz="4"/>
+              <w:left w:val="single" w:color="A6A6A6" w:sz="4"/>
+              <w:bottom w:val="single" w:color="A6A6A6" w:sz="4"/>
+              <w:right w:val="single" w:color="A6A6A6" w:sz="4"/>
+            </w:tcBorders>
+            <w:tcMar>
+              <w:top w:type="dxa" w:w="60"/>
+              <w:left w:type="dxa" w:w="100"/>
+              <w:bottom w:type="dxa" w:w="60"/>
+              <w:right w:type="dxa" w:w="100"/>
+            </w:tcMar>
+          </w:tcPr>
+          <w:p>
+            <w:pPr>
+              <w:keepNext/>
+            </w:pPr>
+            <w:r>
+              <w:rPr>
+                <w:b w:val="false"/>
+                <w:bCs w:val="false"/>
+                <w:sz w:val="20"/>
+                <w:szCs w:val="20"/>
+              </w:rPr>
+              <w:t xml:space="preserve">Coimbra (116 δείγματα)</w:t>
+            </w:r>
+          </w:p>
+        </w:tc>
+        <w:tc>
+          <w:tcPr>
+            <w:tcW w:type="dxa" w:w="2000"/>
+            <w:tcBorders>
+              <w:top w:val="single" w:color="A6A6A6" w:sz="4"/>
+              <w:left w:val="single" w:color="A6A6A6" w:sz="4"/>
+              <w:bottom w:val="single" w:color="A6A6A6" w:sz="4"/>
+              <w:right w:val="single" w:color="A6A6A6" w:sz="4"/>
+            </w:tcBorders>
+            <w:tcMar>
+              <w:top w:type="dxa" w:w="60"/>
+              <w:left w:type="dxa" w:w="100"/>
+              <w:bottom w:type="dxa" w:w="60"/>
+              <w:right w:type="dxa" w:w="100"/>
+            </w:tcMar>
+          </w:tcPr>
+          <w:p>
+            <w:pPr>
+              <w:keepNext/>
+            </w:pPr>
+            <w:r>
+              <w:rPr>
+                <w:b w:val="false"/>
+                <w:bCs w:val="false"/>
+                <w:sz w:val="20"/>
+                <w:szCs w:val="20"/>
+              </w:rPr>
+              <w:t xml:space="preserve">0,80</w:t>
+            </w:r>
+          </w:p>
+        </w:tc>
+        <w:tc>
+          <w:tcPr>
+            <w:tcW w:type="dxa" w:w="2000"/>
+            <w:tcBorders>
+              <w:top w:val="single" w:color="A6A6A6" w:sz="4"/>
+              <w:left w:val="single" w:color="A6A6A6" w:sz="4"/>
+              <w:bottom w:val="single" w:color="A6A6A6" w:sz="4"/>
+              <w:right w:val="single" w:color="A6A6A6" w:sz="4"/>
+            </w:tcBorders>
+            <w:tcMar>
+              <w:top w:type="dxa" w:w="60"/>
+              <w:left w:type="dxa" w:w="100"/>
+              <w:bottom w:type="dxa" w:w="60"/>
+              <w:right w:type="dxa" w:w="100"/>
+            </w:tcMar>
+          </w:tcPr>
+          <w:p>
+            <w:pPr>
+              <w:keepNext/>
+            </w:pPr>
+            <w:r>
+              <w:rPr>
+                <w:b w:val="false"/>
+                <w:bCs w:val="false"/>
+                <w:sz w:val="20"/>
+                <w:szCs w:val="20"/>
+              </w:rPr>
+              <w:t xml:space="preserve">0,67</w:t>
+            </w:r>
+          </w:p>
+        </w:tc>
+        <w:tc>
+          <w:tcPr>
+            <w:tcW w:type="dxa" w:w="2000"/>
+            <w:tcBorders>
+              <w:top w:val="single" w:color="A6A6A6" w:sz="4"/>
+              <w:left w:val="single" w:color="A6A6A6" w:sz="4"/>
+              <w:bottom w:val="single" w:color="A6A6A6" w:sz="4"/>
+              <w:right w:val="single" w:color="A6A6A6" w:sz="4"/>
+            </w:tcBorders>
+            <w:tcMar>
+              <w:top w:type="dxa" w:w="60"/>
+              <w:left w:type="dxa" w:w="100"/>
+              <w:bottom w:type="dxa" w:w="60"/>
+              <w:right w:type="dxa" w:w="100"/>
+            </w:tcMar>
+          </w:tcPr>
+          <w:p>
+            <w:pPr>
+              <w:keepNext/>
+            </w:pPr>
+            <w:r>
+              <w:rPr>
+                <w:b w:val="false"/>
+                <w:bCs w:val="false"/>
+                <w:sz w:val="20"/>
+                <w:szCs w:val="20"/>
+              </w:rPr>
+              <w:t xml:space="preserve">0,91</w:t>
+            </w:r>
+          </w:p>
+        </w:tc>
+      </w:tr>
+      <w:tr>
+        <w:trPr>
+          <w:cantSplit/>
+        </w:trPr>
+        <w:tc>
+          <w:tcPr>
+            <w:tcW w:type="dxa" w:w="3026"/>
+            <w:tcBorders>
+              <w:top w:val="single" w:color="A6A6A6" w:sz="4"/>
+              <w:left w:val="single" w:color="A6A6A6" w:sz="4"/>
+              <w:bottom w:val="single" w:color="A6A6A6" w:sz="4"/>
+              <w:right w:val="single" w:color="A6A6A6" w:sz="4"/>
+            </w:tcBorders>
+            <w:tcMar>
+              <w:top w:type="dxa" w:w="60"/>
+              <w:left w:type="dxa" w:w="100"/>
+              <w:bottom w:type="dxa" w:w="60"/>
+              <w:right w:type="dxa" w:w="100"/>
+            </w:tcMar>
+          </w:tcPr>
+          <w:p>
+            <w:pPr>
+              <w:keepNext w:val="false"/>
+            </w:pPr>
+            <w:r>
+              <w:rPr>
+                <w:b w:val="false"/>
+                <w:bCs w:val="false"/>
+                <w:sz w:val="20"/>
+                <w:szCs w:val="20"/>
+              </w:rPr>
+              <w:t xml:space="preserve">WDBC (569 δείγματα)</w:t>
+            </w:r>
+          </w:p>
+        </w:tc>
+        <w:tc>
+          <w:tcPr>
+            <w:tcW w:type="dxa" w:w="2000"/>
+            <w:tcBorders>
+              <w:top w:val="single" w:color="A6A6A6" w:sz="4"/>
+              <w:left w:val="single" w:color="A6A6A6" w:sz="4"/>
+              <w:bottom w:val="single" w:color="A6A6A6" w:sz="4"/>
+              <w:right w:val="single" w:color="A6A6A6" w:sz="4"/>
+            </w:tcBorders>
+            <w:tcMar>
+              <w:top w:type="dxa" w:w="60"/>
+              <w:left w:type="dxa" w:w="100"/>
+              <w:bottom w:type="dxa" w:w="60"/>
+              <w:right w:type="dxa" w:w="100"/>
+            </w:tcMar>
+          </w:tcPr>
+          <w:p>
+            <w:pPr>
+              <w:keepNext w:val="false"/>
+            </w:pPr>
+            <w:r>
+              <w:rPr>
+                <w:b w:val="false"/>
+                <w:bCs w:val="false"/>
+                <w:sz w:val="20"/>
+                <w:szCs w:val="20"/>
+              </w:rPr>
+              <w:t xml:space="preserve">0,97</w:t>
+            </w:r>
+          </w:p>
+        </w:tc>
+        <w:tc>
+          <w:tcPr>
+            <w:tcW w:type="dxa" w:w="2000"/>
+            <w:tcBorders>
+              <w:top w:val="single" w:color="A6A6A6" w:sz="4"/>
+              <w:left w:val="single" w:color="A6A6A6" w:sz="4"/>
+              <w:bottom w:val="single" w:color="A6A6A6" w:sz="4"/>
+              <w:right w:val="single" w:color="A6A6A6" w:sz="4"/>
+            </w:tcBorders>
+            <w:tcMar>
+              <w:top w:type="dxa" w:w="60"/>
+              <w:left w:type="dxa" w:w="100"/>
+              <w:bottom w:type="dxa" w:w="60"/>
+              <w:right w:type="dxa" w:w="100"/>
+            </w:tcMar>
+          </w:tcPr>
+          <w:p>
+            <w:pPr>
+              <w:keepNext w:val="false"/>
+            </w:pPr>
+            <w:r>
+              <w:rPr>
+                <w:b w:val="false"/>
+                <w:bCs w:val="false"/>
+                <w:sz w:val="20"/>
+                <w:szCs w:val="20"/>
+              </w:rPr>
+              <w:t xml:space="preserve">0,96</w:t>
+            </w:r>
+          </w:p>
+        </w:tc>
+        <w:tc>
+          <w:tcPr>
+            <w:tcW w:type="dxa" w:w="2000"/>
+            <w:tcBorders>
+              <w:top w:val="single" w:color="A6A6A6" w:sz="4"/>
+              <w:left w:val="single" w:color="A6A6A6" w:sz="4"/>
+              <w:bottom w:val="single" w:color="A6A6A6" w:sz="4"/>
+              <w:right w:val="single" w:color="A6A6A6" w:sz="4"/>
+            </w:tcBorders>
+            <w:tcMar>
+              <w:top w:type="dxa" w:w="60"/>
+              <w:left w:type="dxa" w:w="100"/>
+              <w:bottom w:type="dxa" w:w="60"/>
+              <w:right w:type="dxa" w:w="100"/>
+            </w:tcMar>
+          </w:tcPr>
+          <w:p>
+            <w:pPr>
+              <w:keepNext w:val="false"/>
+            </w:pPr>
+            <w:r>
+              <w:rPr>
+                <w:b w:val="false"/>
+                <w:bCs w:val="false"/>
+                <w:sz w:val="20"/>
+                <w:szCs w:val="20"/>
+              </w:rPr>
+              <w:t xml:space="preserve">0,98</w:t>
+            </w:r>
+          </w:p>
+        </w:tc>
+      </w:tr>
+    </w:tbl>
+    <w:p>
+      <w:pPr>
+        <w:spacing w:after="120"/>
+      </w:pPr>
     </w:p>
     <w:p>
       <w:pPr>
@@ -11008,8 +11447,1236 @@
         <w:spacing w:after="80"/>
       </w:pPr>
       <w:r>
-        <w:t xml:space="preserve">Στους πίνακες με έναν χωρισμό: οι ρυθμίσεις κάθε μοντέλου (sigma, αρχιτεκτονική MLP, bottleneck) επιλέχθηκαν με βάση την απόδοση στο ίδιο test set που αναφέρεται στα αποτελέσματα. Οι αριθμοί είναι λίγο αισιόδοξοι σε σχέση με μια καθαρή αξιολόγηση σε ξεχωριστά δεδομένα. Στο cross-validation η επιλογή γίνεται μέσα στα δεδομένα εκπαίδευσης, άρα αυτό το πρόβλημα λύνεται εκεί.</w:t>
+        <w:t xml:space="preserve">Στο Coimbra ακόμη και η ίδια αρχιτεκτονική δίνει πολύ διαφορετικές αναπαραστάσεις ανάλογα με το seed (0,67–0,91). Διαφορές της τάξης του 0,15 στο CKA δεν σημαίνουν κάτι. Στο WDBC, με περισσότερα δεδομένα, οι αναπαραστάσεις είναι σχεδόν ίδιες (0,96–0,98).</w:t>
       </w:r>
+    </w:p>
+    <w:p>
+      <w:pPr>
+        <w:pStyle w:val="Heading2"/>
+      </w:pPr>
+      <w:r>
+        <w:t xml:space="preserve">Heatmaps CKA ανάμεσα σε όλα τα στρώματα</w:t>
+      </w:r>
+    </w:p>
+    <w:p>
+      <w:pPr>
+        <w:spacing w:after="120"/>
+      </w:pPr>
+      <w:r>
+        <w:t xml:space="preserve">Coimbra:</w:t>
+      </w:r>
+    </w:p>
+    <w:p>
+      <w:pPr>
+        <w:spacing w:after="120"/>
+        <w:jc w:val="center"/>
+      </w:pPr>
+      <w:r>
+        <w:drawing>
+          <wp:inline distT="0" distB="0" distL="0" distR="0">
+            <wp:extent cx="4953000" cy="4210050"/>
+            <wp:effectExtent t="0" r="0" b="0" l="0"/>
+            <wp:docPr id="1" name="CKA ανάμεσα σε όλα τα στρώματα, Coimbra" descr="CKA ανάμεσα σε όλα τα στρώματα, Coimbra" title="CKA ανάμεσα σε όλα τα στρώματα, Coimbra"/>
+            <wp:cNvGraphicFramePr>
+              <a:graphicFrameLocks xmlns:a="http://schemas.openxmlformats.org/drawingml/2006/main" noChangeAspect="1"/>
+            </wp:cNvGraphicFramePr>
+            <a:graphic xmlns:a="http://schemas.openxmlformats.org/drawingml/2006/main">
+              <a:graphicData uri="http://schemas.openxmlformats.org/drawingml/2006/picture">
+                <pic:pic xmlns:pic="http://schemas.openxmlformats.org/drawingml/2006/picture">
+                  <pic:nvPicPr>
+                    <pic:cNvPr id="0" name="" descr=""/>
+                    <pic:cNvPicPr>
+                      <a:picLocks noChangeAspect="1" noChangeArrowheads="1"/>
+                    </pic:cNvPicPr>
+                  </pic:nvPicPr>
+                  <pic:blipFill>
+                    <a:blip r:embed="rId7" cstate="none"/>
+                    <a:srcRect/>
+                    <a:stretch>
+                      <a:fillRect/>
+                    </a:stretch>
+                  </pic:blipFill>
+                  <pic:spPr bwMode="auto">
+                    <a:xfrm>
+                      <a:off x="0" y="0"/>
+                      <a:ext cx="4953000" cy="4210050"/>
+                    </a:xfrm>
+                    <a:prstGeom prst="rect">
+                      <a:avLst/>
+                    </a:prstGeom>
+                  </pic:spPr>
+                </pic:pic>
+              </a:graphicData>
+            </a:graphic>
+          </wp:inline>
+        </w:drawing>
+      </w:r>
+    </w:p>
+    <w:p>
+      <w:pPr>
+        <w:spacing w:after="120"/>
+      </w:pPr>
+      <w:r>
+        <w:t xml:space="preserve">WDBC:</w:t>
+      </w:r>
+    </w:p>
+    <w:p>
+      <w:pPr>
+        <w:spacing w:after="120"/>
+        <w:jc w:val="center"/>
+      </w:pPr>
+      <w:r>
+        <w:drawing>
+          <wp:inline distT="0" distB="0" distL="0" distR="0">
+            <wp:extent cx="4953000" cy="4210050"/>
+            <wp:effectExtent t="0" r="0" b="0" l="0"/>
+            <wp:docPr id="1" name="CKA ανάμεσα σε όλα τα στρώματα, WDBC" descr="CKA ανάμεσα σε όλα τα στρώματα, WDBC" title="CKA ανάμεσα σε όλα τα στρώματα, WDBC"/>
+            <wp:cNvGraphicFramePr>
+              <a:graphicFrameLocks xmlns:a="http://schemas.openxmlformats.org/drawingml/2006/main" noChangeAspect="1"/>
+            </wp:cNvGraphicFramePr>
+            <a:graphic xmlns:a="http://schemas.openxmlformats.org/drawingml/2006/main">
+              <a:graphicData uri="http://schemas.openxmlformats.org/drawingml/2006/picture">
+                <pic:pic xmlns:pic="http://schemas.openxmlformats.org/drawingml/2006/picture">
+                  <pic:nvPicPr>
+                    <pic:cNvPr id="0" name="" descr=""/>
+                    <pic:cNvPicPr>
+                      <a:picLocks noChangeAspect="1" noChangeArrowheads="1"/>
+                    </pic:cNvPicPr>
+                  </pic:nvPicPr>
+                  <pic:blipFill>
+                    <a:blip r:embed="rId8" cstate="none"/>
+                    <a:srcRect/>
+                    <a:stretch>
+                      <a:fillRect/>
+                    </a:stretch>
+                  </pic:blipFill>
+                  <pic:spPr bwMode="auto">
+                    <a:xfrm>
+                      <a:off x="0" y="0"/>
+                      <a:ext cx="4953000" cy="4210050"/>
+                    </a:xfrm>
+                    <a:prstGeom prst="rect">
+                      <a:avLst/>
+                    </a:prstGeom>
+                  </pic:spPr>
+                </pic:pic>
+              </a:graphicData>
+            </a:graphic>
+          </wp:inline>
+        </w:drawing>
+      </w:r>
+    </w:p>
+    <w:p>
+      <w:pPr>
+        <w:pStyle w:val="Heading2"/>
+      </w:pPr>
+      <w:r>
+        <w:t xml:space="preserve">Βασικές τιμές</w:t>
+      </w:r>
+    </w:p>
+    <w:tbl>
+      <w:tblPr>
+        <w:tblW w:type="dxa" w:w="9026"/>
+        <w:tblBorders>
+          <w:top w:val="single" w:color="auto" w:sz="4"/>
+          <w:left w:val="single" w:color="auto" w:sz="4"/>
+          <w:bottom w:val="single" w:color="auto" w:sz="4"/>
+          <w:right w:val="single" w:color="auto" w:sz="4"/>
+          <w:insideH w:val="single" w:color="auto" w:sz="4"/>
+          <w:insideV w:val="single" w:color="auto" w:sz="4"/>
+        </w:tblBorders>
+      </w:tblPr>
+      <w:tblGrid>
+        <w:gridCol w:w="5026"/>
+        <w:gridCol w:w="2000"/>
+        <w:gridCol w:w="2000"/>
+      </w:tblGrid>
+      <w:tr>
+        <w:trPr>
+          <w:tblHeader/>
+        </w:trPr>
+        <w:tc>
+          <w:tcPr>
+            <w:tcW w:type="dxa" w:w="5026"/>
+            <w:tcBorders>
+              <w:top w:val="single" w:color="A6A6A6" w:sz="4"/>
+              <w:left w:val="single" w:color="A6A6A6" w:sz="4"/>
+              <w:bottom w:val="single" w:color="A6A6A6" w:sz="4"/>
+              <w:right w:val="single" w:color="A6A6A6" w:sz="4"/>
+            </w:tcBorders>
+            <w:shd w:fill="DCE9F1" w:color="auto" w:val="clear"/>
+            <w:tcMar>
+              <w:top w:type="dxa" w:w="60"/>
+              <w:left w:type="dxa" w:w="100"/>
+              <w:bottom w:type="dxa" w:w="60"/>
+              <w:right w:type="dxa" w:w="100"/>
+            </w:tcMar>
+          </w:tcPr>
+          <w:p>
+            <w:pPr>
+              <w:keepNext/>
+            </w:pPr>
+            <w:r>
+              <w:rPr>
+                <w:b/>
+                <w:bCs/>
+                <w:sz w:val="20"/>
+                <w:szCs w:val="20"/>
+              </w:rPr>
+              <w:t xml:space="preserve">Σύγκριση</w:t>
+            </w:r>
+          </w:p>
+        </w:tc>
+        <w:tc>
+          <w:tcPr>
+            <w:tcW w:type="dxa" w:w="2000"/>
+            <w:tcBorders>
+              <w:top w:val="single" w:color="A6A6A6" w:sz="4"/>
+              <w:left w:val="single" w:color="A6A6A6" w:sz="4"/>
+              <w:bottom w:val="single" w:color="A6A6A6" w:sz="4"/>
+              <w:right w:val="single" w:color="A6A6A6" w:sz="4"/>
+            </w:tcBorders>
+            <w:shd w:fill="DCE9F1" w:color="auto" w:val="clear"/>
+            <w:tcMar>
+              <w:top w:type="dxa" w:w="60"/>
+              <w:left w:type="dxa" w:w="100"/>
+              <w:bottom w:type="dxa" w:w="60"/>
+              <w:right w:type="dxa" w:w="100"/>
+            </w:tcMar>
+          </w:tcPr>
+          <w:p>
+            <w:pPr>
+              <w:keepNext/>
+            </w:pPr>
+            <w:r>
+              <w:rPr>
+                <w:b/>
+                <w:bCs/>
+                <w:sz w:val="20"/>
+                <w:szCs w:val="20"/>
+              </w:rPr>
+              <w:t xml:space="preserve">Coimbra</w:t>
+            </w:r>
+          </w:p>
+        </w:tc>
+        <w:tc>
+          <w:tcPr>
+            <w:tcW w:type="dxa" w:w="2000"/>
+            <w:tcBorders>
+              <w:top w:val="single" w:color="A6A6A6" w:sz="4"/>
+              <w:left w:val="single" w:color="A6A6A6" w:sz="4"/>
+              <w:bottom w:val="single" w:color="A6A6A6" w:sz="4"/>
+              <w:right w:val="single" w:color="A6A6A6" w:sz="4"/>
+            </w:tcBorders>
+            <w:shd w:fill="DCE9F1" w:color="auto" w:val="clear"/>
+            <w:tcMar>
+              <w:top w:type="dxa" w:w="60"/>
+              <w:left w:type="dxa" w:w="100"/>
+              <w:bottom w:type="dxa" w:w="60"/>
+              <w:right w:type="dxa" w:w="100"/>
+            </w:tcMar>
+          </w:tcPr>
+          <w:p>
+            <w:pPr>
+              <w:keepNext/>
+            </w:pPr>
+            <w:r>
+              <w:rPr>
+                <w:b/>
+                <w:bCs/>
+                <w:sz w:val="20"/>
+                <w:szCs w:val="20"/>
+              </w:rPr>
+              <w:t xml:space="preserve">WDBC</w:t>
+            </w:r>
+          </w:p>
+        </w:tc>
+      </w:tr>
+      <w:tr>
+        <w:trPr>
+          <w:cantSplit/>
+        </w:trPr>
+        <w:tc>
+          <w:tcPr>
+            <w:tcW w:type="dxa" w:w="5026"/>
+            <w:tcBorders>
+              <w:top w:val="single" w:color="A6A6A6" w:sz="4"/>
+              <w:left w:val="single" w:color="A6A6A6" w:sz="4"/>
+              <w:bottom w:val="single" w:color="A6A6A6" w:sz="4"/>
+              <w:right w:val="single" w:color="A6A6A6" w:sz="4"/>
+            </w:tcBorders>
+            <w:tcMar>
+              <w:top w:type="dxa" w:w="60"/>
+              <w:left w:type="dxa" w:w="100"/>
+              <w:bottom w:type="dxa" w:w="60"/>
+              <w:right w:type="dxa" w:w="100"/>
+            </w:tcMar>
+          </w:tcPr>
+          <w:p>
+            <w:pPr>
+              <w:keepNext/>
+            </w:pPr>
+            <w:r>
+              <w:rPr>
+                <w:b w:val="false"/>
+                <w:bCs w:val="false"/>
+                <w:sz w:val="20"/>
+                <w:szCs w:val="20"/>
+              </w:rPr>
+              <w:t xml:space="preserve">MLP: είσοδος – κρυφό στρώμα</w:t>
+            </w:r>
+          </w:p>
+        </w:tc>
+        <w:tc>
+          <w:tcPr>
+            <w:tcW w:type="dxa" w:w="2000"/>
+            <w:tcBorders>
+              <w:top w:val="single" w:color="A6A6A6" w:sz="4"/>
+              <w:left w:val="single" w:color="A6A6A6" w:sz="4"/>
+              <w:bottom w:val="single" w:color="A6A6A6" w:sz="4"/>
+              <w:right w:val="single" w:color="A6A6A6" w:sz="4"/>
+            </w:tcBorders>
+            <w:tcMar>
+              <w:top w:type="dxa" w:w="60"/>
+              <w:left w:type="dxa" w:w="100"/>
+              <w:bottom w:type="dxa" w:w="60"/>
+              <w:right w:type="dxa" w:w="100"/>
+            </w:tcMar>
+          </w:tcPr>
+          <w:p>
+            <w:pPr>
+              <w:keepNext/>
+            </w:pPr>
+            <w:r>
+              <w:rPr>
+                <w:b w:val="false"/>
+                <w:bCs w:val="false"/>
+                <w:sz w:val="20"/>
+                <w:szCs w:val="20"/>
+              </w:rPr>
+              <w:t xml:space="preserve">0,84</w:t>
+            </w:r>
+          </w:p>
+        </w:tc>
+        <w:tc>
+          <w:tcPr>
+            <w:tcW w:type="dxa" w:w="2000"/>
+            <w:tcBorders>
+              <w:top w:val="single" w:color="A6A6A6" w:sz="4"/>
+              <w:left w:val="single" w:color="A6A6A6" w:sz="4"/>
+              <w:bottom w:val="single" w:color="A6A6A6" w:sz="4"/>
+              <w:right w:val="single" w:color="A6A6A6" w:sz="4"/>
+            </w:tcBorders>
+            <w:tcMar>
+              <w:top w:type="dxa" w:w="60"/>
+              <w:left w:type="dxa" w:w="100"/>
+              <w:bottom w:type="dxa" w:w="60"/>
+              <w:right w:type="dxa" w:w="100"/>
+            </w:tcMar>
+          </w:tcPr>
+          <w:p>
+            <w:pPr>
+              <w:keepNext/>
+            </w:pPr>
+            <w:r>
+              <w:rPr>
+                <w:b w:val="false"/>
+                <w:bCs w:val="false"/>
+                <w:sz w:val="20"/>
+                <w:szCs w:val="20"/>
+              </w:rPr>
+              <w:t xml:space="preserve">0,81</w:t>
+            </w:r>
+          </w:p>
+        </w:tc>
+      </w:tr>
+      <w:tr>
+        <w:trPr>
+          <w:cantSplit/>
+        </w:trPr>
+        <w:tc>
+          <w:tcPr>
+            <w:tcW w:type="dxa" w:w="5026"/>
+            <w:tcBorders>
+              <w:top w:val="single" w:color="A6A6A6" w:sz="4"/>
+              <w:left w:val="single" w:color="A6A6A6" w:sz="4"/>
+              <w:bottom w:val="single" w:color="A6A6A6" w:sz="4"/>
+              <w:right w:val="single" w:color="A6A6A6" w:sz="4"/>
+            </w:tcBorders>
+            <w:tcMar>
+              <w:top w:type="dxa" w:w="60"/>
+              <w:left w:type="dxa" w:w="100"/>
+              <w:bottom w:type="dxa" w:w="60"/>
+              <w:right w:type="dxa" w:w="100"/>
+            </w:tcMar>
+          </w:tcPr>
+          <w:p>
+            <w:pPr>
+              <w:keepNext/>
+            </w:pPr>
+            <w:r>
+              <w:rPr>
+                <w:b w:val="false"/>
+                <w:bCs w:val="false"/>
+                <w:sz w:val="20"/>
+                <w:szCs w:val="20"/>
+              </w:rPr>
+              <w:t xml:space="preserve">MLP με 2 στρώματα: κρυφό 1 – κρυφό 2</w:t>
+            </w:r>
+          </w:p>
+        </w:tc>
+        <w:tc>
+          <w:tcPr>
+            <w:tcW w:type="dxa" w:w="2000"/>
+            <w:tcBorders>
+              <w:top w:val="single" w:color="A6A6A6" w:sz="4"/>
+              <w:left w:val="single" w:color="A6A6A6" w:sz="4"/>
+              <w:bottom w:val="single" w:color="A6A6A6" w:sz="4"/>
+              <w:right w:val="single" w:color="A6A6A6" w:sz="4"/>
+            </w:tcBorders>
+            <w:tcMar>
+              <w:top w:type="dxa" w:w="60"/>
+              <w:left w:type="dxa" w:w="100"/>
+              <w:bottom w:type="dxa" w:w="60"/>
+              <w:right w:type="dxa" w:w="100"/>
+            </w:tcMar>
+          </w:tcPr>
+          <w:p>
+            <w:pPr>
+              <w:keepNext/>
+            </w:pPr>
+            <w:r>
+              <w:rPr>
+                <w:b w:val="false"/>
+                <w:bCs w:val="false"/>
+                <w:sz w:val="20"/>
+                <w:szCs w:val="20"/>
+              </w:rPr>
+              <w:t xml:space="preserve">0,66</w:t>
+            </w:r>
+          </w:p>
+        </w:tc>
+        <w:tc>
+          <w:tcPr>
+            <w:tcW w:type="dxa" w:w="2000"/>
+            <w:tcBorders>
+              <w:top w:val="single" w:color="A6A6A6" w:sz="4"/>
+              <w:left w:val="single" w:color="A6A6A6" w:sz="4"/>
+              <w:bottom w:val="single" w:color="A6A6A6" w:sz="4"/>
+              <w:right w:val="single" w:color="A6A6A6" w:sz="4"/>
+            </w:tcBorders>
+            <w:tcMar>
+              <w:top w:type="dxa" w:w="60"/>
+              <w:left w:type="dxa" w:w="100"/>
+              <w:bottom w:type="dxa" w:w="60"/>
+              <w:right w:type="dxa" w:w="100"/>
+            </w:tcMar>
+          </w:tcPr>
+          <w:p>
+            <w:pPr>
+              <w:keepNext/>
+            </w:pPr>
+            <w:r>
+              <w:rPr>
+                <w:b w:val="false"/>
+                <w:bCs w:val="false"/>
+                <w:sz w:val="20"/>
+                <w:szCs w:val="20"/>
+              </w:rPr>
+              <w:t xml:space="preserve">0,99</w:t>
+            </w:r>
+          </w:p>
+        </w:tc>
+      </w:tr>
+      <w:tr>
+        <w:trPr>
+          <w:cantSplit/>
+        </w:trPr>
+        <w:tc>
+          <w:tcPr>
+            <w:tcW w:type="dxa" w:w="5026"/>
+            <w:tcBorders>
+              <w:top w:val="single" w:color="A6A6A6" w:sz="4"/>
+              <w:left w:val="single" w:color="A6A6A6" w:sz="4"/>
+              <w:bottom w:val="single" w:color="A6A6A6" w:sz="4"/>
+              <w:right w:val="single" w:color="A6A6A6" w:sz="4"/>
+            </w:tcBorders>
+            <w:tcMar>
+              <w:top w:type="dxa" w:w="60"/>
+              <w:left w:type="dxa" w:w="100"/>
+              <w:bottom w:type="dxa" w:w="60"/>
+              <w:right w:type="dxa" w:w="100"/>
+            </w:tcMar>
+          </w:tcPr>
+          <w:p>
+            <w:pPr>
+              <w:keepNext/>
+            </w:pPr>
+            <w:r>
+              <w:rPr>
+                <w:b w:val="false"/>
+                <w:bCs w:val="false"/>
+                <w:sz w:val="20"/>
+                <w:szCs w:val="20"/>
+              </w:rPr>
+              <w:t xml:space="preserve">MLP με 2 στρώματα: κρυφό 2 – έξοδος</w:t>
+            </w:r>
+          </w:p>
+        </w:tc>
+        <w:tc>
+          <w:tcPr>
+            <w:tcW w:type="dxa" w:w="2000"/>
+            <w:tcBorders>
+              <w:top w:val="single" w:color="A6A6A6" w:sz="4"/>
+              <w:left w:val="single" w:color="A6A6A6" w:sz="4"/>
+              <w:bottom w:val="single" w:color="A6A6A6" w:sz="4"/>
+              <w:right w:val="single" w:color="A6A6A6" w:sz="4"/>
+            </w:tcBorders>
+            <w:tcMar>
+              <w:top w:type="dxa" w:w="60"/>
+              <w:left w:type="dxa" w:w="100"/>
+              <w:bottom w:type="dxa" w:w="60"/>
+              <w:right w:type="dxa" w:w="100"/>
+            </w:tcMar>
+          </w:tcPr>
+          <w:p>
+            <w:pPr>
+              <w:keepNext/>
+            </w:pPr>
+            <w:r>
+              <w:rPr>
+                <w:b w:val="false"/>
+                <w:bCs w:val="false"/>
+                <w:sz w:val="20"/>
+                <w:szCs w:val="20"/>
+              </w:rPr>
+              <w:t xml:space="preserve">0,76</w:t>
+            </w:r>
+          </w:p>
+        </w:tc>
+        <w:tc>
+          <w:tcPr>
+            <w:tcW w:type="dxa" w:w="2000"/>
+            <w:tcBorders>
+              <w:top w:val="single" w:color="A6A6A6" w:sz="4"/>
+              <w:left w:val="single" w:color="A6A6A6" w:sz="4"/>
+              <w:bottom w:val="single" w:color="A6A6A6" w:sz="4"/>
+              <w:right w:val="single" w:color="A6A6A6" w:sz="4"/>
+            </w:tcBorders>
+            <w:tcMar>
+              <w:top w:type="dxa" w:w="60"/>
+              <w:left w:type="dxa" w:w="100"/>
+              <w:bottom w:type="dxa" w:w="60"/>
+              <w:right w:type="dxa" w:w="100"/>
+            </w:tcMar>
+          </w:tcPr>
+          <w:p>
+            <w:pPr>
+              <w:keepNext/>
+            </w:pPr>
+            <w:r>
+              <w:rPr>
+                <w:b w:val="false"/>
+                <w:bCs w:val="false"/>
+                <w:sz w:val="20"/>
+                <w:szCs w:val="20"/>
+              </w:rPr>
+              <w:t xml:space="preserve">0,80</w:t>
+            </w:r>
+          </w:p>
+        </w:tc>
+      </w:tr>
+      <w:tr>
+        <w:trPr>
+          <w:cantSplit/>
+        </w:trPr>
+        <w:tc>
+          <w:tcPr>
+            <w:tcW w:type="dxa" w:w="5026"/>
+            <w:tcBorders>
+              <w:top w:val="single" w:color="A6A6A6" w:sz="4"/>
+              <w:left w:val="single" w:color="A6A6A6" w:sz="4"/>
+              <w:bottom w:val="single" w:color="A6A6A6" w:sz="4"/>
+              <w:right w:val="single" w:color="A6A6A6" w:sz="4"/>
+            </w:tcBorders>
+            <w:tcMar>
+              <w:top w:type="dxa" w:w="60"/>
+              <w:left w:type="dxa" w:w="100"/>
+              <w:bottom w:type="dxa" w:w="60"/>
+              <w:right w:type="dxa" w:w="100"/>
+            </w:tcMar>
+          </w:tcPr>
+          <w:p>
+            <w:pPr>
+              <w:keepNext/>
+            </w:pPr>
+            <w:r>
+              <w:rPr>
+                <w:b w:val="false"/>
+                <w:bCs w:val="false"/>
+                <w:sz w:val="20"/>
+                <w:szCs w:val="20"/>
+              </w:rPr>
+              <w:t xml:space="preserve">Autoencoder: είσοδος – bottleneck</w:t>
+            </w:r>
+          </w:p>
+        </w:tc>
+        <w:tc>
+          <w:tcPr>
+            <w:tcW w:type="dxa" w:w="2000"/>
+            <w:tcBorders>
+              <w:top w:val="single" w:color="A6A6A6" w:sz="4"/>
+              <w:left w:val="single" w:color="A6A6A6" w:sz="4"/>
+              <w:bottom w:val="single" w:color="A6A6A6" w:sz="4"/>
+              <w:right w:val="single" w:color="A6A6A6" w:sz="4"/>
+            </w:tcBorders>
+            <w:tcMar>
+              <w:top w:type="dxa" w:w="60"/>
+              <w:left w:type="dxa" w:w="100"/>
+              <w:bottom w:type="dxa" w:w="60"/>
+              <w:right w:type="dxa" w:w="100"/>
+            </w:tcMar>
+          </w:tcPr>
+          <w:p>
+            <w:pPr>
+              <w:keepNext/>
+            </w:pPr>
+            <w:r>
+              <w:rPr>
+                <w:b w:val="false"/>
+                <w:bCs w:val="false"/>
+                <w:sz w:val="20"/>
+                <w:szCs w:val="20"/>
+              </w:rPr>
+              <w:t xml:space="preserve">0,88</w:t>
+            </w:r>
+          </w:p>
+        </w:tc>
+        <w:tc>
+          <w:tcPr>
+            <w:tcW w:type="dxa" w:w="2000"/>
+            <w:tcBorders>
+              <w:top w:val="single" w:color="A6A6A6" w:sz="4"/>
+              <w:left w:val="single" w:color="A6A6A6" w:sz="4"/>
+              <w:bottom w:val="single" w:color="A6A6A6" w:sz="4"/>
+              <w:right w:val="single" w:color="A6A6A6" w:sz="4"/>
+            </w:tcBorders>
+            <w:tcMar>
+              <w:top w:type="dxa" w:w="60"/>
+              <w:left w:type="dxa" w:w="100"/>
+              <w:bottom w:type="dxa" w:w="60"/>
+              <w:right w:type="dxa" w:w="100"/>
+            </w:tcMar>
+          </w:tcPr>
+          <w:p>
+            <w:pPr>
+              <w:keepNext/>
+            </w:pPr>
+            <w:r>
+              <w:rPr>
+                <w:b w:val="false"/>
+                <w:bCs w:val="false"/>
+                <w:sz w:val="20"/>
+                <w:szCs w:val="20"/>
+              </w:rPr>
+              <w:t xml:space="preserve">0,57</w:t>
+            </w:r>
+          </w:p>
+        </w:tc>
+      </w:tr>
+      <w:tr>
+        <w:trPr>
+          <w:cantSplit/>
+        </w:trPr>
+        <w:tc>
+          <w:tcPr>
+            <w:tcW w:type="dxa" w:w="5026"/>
+            <w:tcBorders>
+              <w:top w:val="single" w:color="A6A6A6" w:sz="4"/>
+              <w:left w:val="single" w:color="A6A6A6" w:sz="4"/>
+              <w:bottom w:val="single" w:color="A6A6A6" w:sz="4"/>
+              <w:right w:val="single" w:color="A6A6A6" w:sz="4"/>
+            </w:tcBorders>
+            <w:tcMar>
+              <w:top w:type="dxa" w:w="60"/>
+              <w:left w:type="dxa" w:w="100"/>
+              <w:bottom w:type="dxa" w:w="60"/>
+              <w:right w:type="dxa" w:w="100"/>
+            </w:tcMar>
+          </w:tcPr>
+          <w:p>
+            <w:pPr>
+              <w:keepNext/>
+            </w:pPr>
+            <w:r>
+              <w:rPr>
+                <w:b w:val="false"/>
+                <w:bCs w:val="false"/>
+                <w:sz w:val="20"/>
+                <w:szCs w:val="20"/>
+              </w:rPr>
+              <w:t xml:space="preserve">MLP κρυφό 1 – Autoencoder bottleneck</w:t>
+            </w:r>
+          </w:p>
+        </w:tc>
+        <w:tc>
+          <w:tcPr>
+            <w:tcW w:type="dxa" w:w="2000"/>
+            <w:tcBorders>
+              <w:top w:val="single" w:color="A6A6A6" w:sz="4"/>
+              <w:left w:val="single" w:color="A6A6A6" w:sz="4"/>
+              <w:bottom w:val="single" w:color="A6A6A6" w:sz="4"/>
+              <w:right w:val="single" w:color="A6A6A6" w:sz="4"/>
+            </w:tcBorders>
+            <w:tcMar>
+              <w:top w:type="dxa" w:w="60"/>
+              <w:left w:type="dxa" w:w="100"/>
+              <w:bottom w:type="dxa" w:w="60"/>
+              <w:right w:type="dxa" w:w="100"/>
+            </w:tcMar>
+          </w:tcPr>
+          <w:p>
+            <w:pPr>
+              <w:keepNext/>
+            </w:pPr>
+            <w:r>
+              <w:rPr>
+                <w:b w:val="false"/>
+                <w:bCs w:val="false"/>
+                <w:sz w:val="20"/>
+                <w:szCs w:val="20"/>
+              </w:rPr>
+              <w:t xml:space="preserve">0,77</w:t>
+            </w:r>
+          </w:p>
+        </w:tc>
+        <w:tc>
+          <w:tcPr>
+            <w:tcW w:type="dxa" w:w="2000"/>
+            <w:tcBorders>
+              <w:top w:val="single" w:color="A6A6A6" w:sz="4"/>
+              <w:left w:val="single" w:color="A6A6A6" w:sz="4"/>
+              <w:bottom w:val="single" w:color="A6A6A6" w:sz="4"/>
+              <w:right w:val="single" w:color="A6A6A6" w:sz="4"/>
+            </w:tcBorders>
+            <w:tcMar>
+              <w:top w:type="dxa" w:w="60"/>
+              <w:left w:type="dxa" w:w="100"/>
+              <w:bottom w:type="dxa" w:w="60"/>
+              <w:right w:type="dxa" w:w="100"/>
+            </w:tcMar>
+          </w:tcPr>
+          <w:p>
+            <w:pPr>
+              <w:keepNext/>
+            </w:pPr>
+            <w:r>
+              <w:rPr>
+                <w:b w:val="false"/>
+                <w:bCs w:val="false"/>
+                <w:sz w:val="20"/>
+                <w:szCs w:val="20"/>
+              </w:rPr>
+              <w:t xml:space="preserve">0,27</w:t>
+            </w:r>
+          </w:p>
+        </w:tc>
+      </w:tr>
+      <w:tr>
+        <w:trPr>
+          <w:cantSplit/>
+        </w:trPr>
+        <w:tc>
+          <w:tcPr>
+            <w:tcW w:type="dxa" w:w="5026"/>
+            <w:tcBorders>
+              <w:top w:val="single" w:color="A6A6A6" w:sz="4"/>
+              <w:left w:val="single" w:color="A6A6A6" w:sz="4"/>
+              <w:bottom w:val="single" w:color="A6A6A6" w:sz="4"/>
+              <w:right w:val="single" w:color="A6A6A6" w:sz="4"/>
+            </w:tcBorders>
+            <w:tcMar>
+              <w:top w:type="dxa" w:w="60"/>
+              <w:left w:type="dxa" w:w="100"/>
+              <w:bottom w:type="dxa" w:w="60"/>
+              <w:right w:type="dxa" w:w="100"/>
+            </w:tcMar>
+          </w:tcPr>
+          <w:p>
+            <w:pPr>
+              <w:keepNext/>
+            </w:pPr>
+            <w:r>
+              <w:rPr>
+                <w:b w:val="false"/>
+                <w:bCs w:val="false"/>
+                <w:sz w:val="20"/>
+                <w:szCs w:val="20"/>
+              </w:rPr>
+              <w:t xml:space="preserve">TabNet: βήμα 1 – βήμα 2</w:t>
+            </w:r>
+          </w:p>
+        </w:tc>
+        <w:tc>
+          <w:tcPr>
+            <w:tcW w:type="dxa" w:w="2000"/>
+            <w:tcBorders>
+              <w:top w:val="single" w:color="A6A6A6" w:sz="4"/>
+              <w:left w:val="single" w:color="A6A6A6" w:sz="4"/>
+              <w:bottom w:val="single" w:color="A6A6A6" w:sz="4"/>
+              <w:right w:val="single" w:color="A6A6A6" w:sz="4"/>
+            </w:tcBorders>
+            <w:tcMar>
+              <w:top w:type="dxa" w:w="60"/>
+              <w:left w:type="dxa" w:w="100"/>
+              <w:bottom w:type="dxa" w:w="60"/>
+              <w:right w:type="dxa" w:w="100"/>
+            </w:tcMar>
+          </w:tcPr>
+          <w:p>
+            <w:pPr>
+              <w:keepNext/>
+            </w:pPr>
+            <w:r>
+              <w:rPr>
+                <w:b w:val="false"/>
+                <w:bCs w:val="false"/>
+                <w:sz w:val="20"/>
+                <w:szCs w:val="20"/>
+              </w:rPr>
+              <w:t xml:space="preserve">0,04</w:t>
+            </w:r>
+          </w:p>
+        </w:tc>
+        <w:tc>
+          <w:tcPr>
+            <w:tcW w:type="dxa" w:w="2000"/>
+            <w:tcBorders>
+              <w:top w:val="single" w:color="A6A6A6" w:sz="4"/>
+              <w:left w:val="single" w:color="A6A6A6" w:sz="4"/>
+              <w:bottom w:val="single" w:color="A6A6A6" w:sz="4"/>
+              <w:right w:val="single" w:color="A6A6A6" w:sz="4"/>
+            </w:tcBorders>
+            <w:tcMar>
+              <w:top w:type="dxa" w:w="60"/>
+              <w:left w:type="dxa" w:w="100"/>
+              <w:bottom w:type="dxa" w:w="60"/>
+              <w:right w:type="dxa" w:w="100"/>
+            </w:tcMar>
+          </w:tcPr>
+          <w:p>
+            <w:pPr>
+              <w:keepNext/>
+            </w:pPr>
+            <w:r>
+              <w:rPr>
+                <w:b w:val="false"/>
+                <w:bCs w:val="false"/>
+                <w:sz w:val="20"/>
+                <w:szCs w:val="20"/>
+              </w:rPr>
+              <w:t xml:space="preserve">0,16</w:t>
+            </w:r>
+          </w:p>
+        </w:tc>
+      </w:tr>
+      <w:tr>
+        <w:trPr>
+          <w:cantSplit/>
+        </w:trPr>
+        <w:tc>
+          <w:tcPr>
+            <w:tcW w:type="dxa" w:w="5026"/>
+            <w:tcBorders>
+              <w:top w:val="single" w:color="A6A6A6" w:sz="4"/>
+              <w:left w:val="single" w:color="A6A6A6" w:sz="4"/>
+              <w:bottom w:val="single" w:color="A6A6A6" w:sz="4"/>
+              <w:right w:val="single" w:color="A6A6A6" w:sz="4"/>
+            </w:tcBorders>
+            <w:tcMar>
+              <w:top w:type="dxa" w:w="60"/>
+              <w:left w:type="dxa" w:w="100"/>
+              <w:bottom w:type="dxa" w:w="60"/>
+              <w:right w:type="dxa" w:w="100"/>
+            </w:tcMar>
+          </w:tcPr>
+          <w:p>
+            <w:pPr>
+              <w:keepNext/>
+            </w:pPr>
+            <w:r>
+              <w:rPr>
+                <w:b w:val="false"/>
+                <w:bCs w:val="false"/>
+                <w:sz w:val="20"/>
+                <w:szCs w:val="20"/>
+              </w:rPr>
+              <w:t xml:space="preserve">TabNet: decision – έξοδος</w:t>
+            </w:r>
+          </w:p>
+        </w:tc>
+        <w:tc>
+          <w:tcPr>
+            <w:tcW w:type="dxa" w:w="2000"/>
+            <w:tcBorders>
+              <w:top w:val="single" w:color="A6A6A6" w:sz="4"/>
+              <w:left w:val="single" w:color="A6A6A6" w:sz="4"/>
+              <w:bottom w:val="single" w:color="A6A6A6" w:sz="4"/>
+              <w:right w:val="single" w:color="A6A6A6" w:sz="4"/>
+            </w:tcBorders>
+            <w:tcMar>
+              <w:top w:type="dxa" w:w="60"/>
+              <w:left w:type="dxa" w:w="100"/>
+              <w:bottom w:type="dxa" w:w="60"/>
+              <w:right w:type="dxa" w:w="100"/>
+            </w:tcMar>
+          </w:tcPr>
+          <w:p>
+            <w:pPr>
+              <w:keepNext/>
+            </w:pPr>
+            <w:r>
+              <w:rPr>
+                <w:b w:val="false"/>
+                <w:bCs w:val="false"/>
+                <w:sz w:val="20"/>
+                <w:szCs w:val="20"/>
+              </w:rPr>
+              <w:t xml:space="preserve">0,96</w:t>
+            </w:r>
+          </w:p>
+        </w:tc>
+        <w:tc>
+          <w:tcPr>
+            <w:tcW w:type="dxa" w:w="2000"/>
+            <w:tcBorders>
+              <w:top w:val="single" w:color="A6A6A6" w:sz="4"/>
+              <w:left w:val="single" w:color="A6A6A6" w:sz="4"/>
+              <w:bottom w:val="single" w:color="A6A6A6" w:sz="4"/>
+              <w:right w:val="single" w:color="A6A6A6" w:sz="4"/>
+            </w:tcBorders>
+            <w:tcMar>
+              <w:top w:type="dxa" w:w="60"/>
+              <w:left w:type="dxa" w:w="100"/>
+              <w:bottom w:type="dxa" w:w="60"/>
+              <w:right w:type="dxa" w:w="100"/>
+            </w:tcMar>
+          </w:tcPr>
+          <w:p>
+            <w:pPr>
+              <w:keepNext/>
+            </w:pPr>
+            <w:r>
+              <w:rPr>
+                <w:b w:val="false"/>
+                <w:bCs w:val="false"/>
+                <w:sz w:val="20"/>
+                <w:szCs w:val="20"/>
+              </w:rPr>
+              <w:t xml:space="preserve">0,94</w:t>
+            </w:r>
+          </w:p>
+        </w:tc>
+      </w:tr>
+      <w:tr>
+        <w:trPr>
+          <w:cantSplit/>
+        </w:trPr>
+        <w:tc>
+          <w:tcPr>
+            <w:tcW w:type="dxa" w:w="5026"/>
+            <w:tcBorders>
+              <w:top w:val="single" w:color="A6A6A6" w:sz="4"/>
+              <w:left w:val="single" w:color="A6A6A6" w:sz="4"/>
+              <w:bottom w:val="single" w:color="A6A6A6" w:sz="4"/>
+              <w:right w:val="single" w:color="A6A6A6" w:sz="4"/>
+            </w:tcBorders>
+            <w:tcMar>
+              <w:top w:type="dxa" w:w="60"/>
+              <w:left w:type="dxa" w:w="100"/>
+              <w:bottom w:type="dxa" w:w="60"/>
+              <w:right w:type="dxa" w:w="100"/>
+            </w:tcMar>
+          </w:tcPr>
+          <w:p>
+            <w:pPr>
+              <w:keepNext/>
+            </w:pPr>
+            <w:r>
+              <w:rPr>
+                <w:b w:val="false"/>
+                <w:bCs w:val="false"/>
+                <w:sz w:val="20"/>
+                <w:szCs w:val="20"/>
+              </w:rPr>
+              <w:t xml:space="preserve">Έξοδος MLP – έξοδος MLP με 2 στρώματα</w:t>
+            </w:r>
+          </w:p>
+        </w:tc>
+        <w:tc>
+          <w:tcPr>
+            <w:tcW w:type="dxa" w:w="2000"/>
+            <w:tcBorders>
+              <w:top w:val="single" w:color="A6A6A6" w:sz="4"/>
+              <w:left w:val="single" w:color="A6A6A6" w:sz="4"/>
+              <w:bottom w:val="single" w:color="A6A6A6" w:sz="4"/>
+              <w:right w:val="single" w:color="A6A6A6" w:sz="4"/>
+            </w:tcBorders>
+            <w:tcMar>
+              <w:top w:type="dxa" w:w="60"/>
+              <w:left w:type="dxa" w:w="100"/>
+              <w:bottom w:type="dxa" w:w="60"/>
+              <w:right w:type="dxa" w:w="100"/>
+            </w:tcMar>
+          </w:tcPr>
+          <w:p>
+            <w:pPr>
+              <w:keepNext/>
+            </w:pPr>
+            <w:r>
+              <w:rPr>
+                <w:b w:val="false"/>
+                <w:bCs w:val="false"/>
+                <w:sz w:val="20"/>
+                <w:szCs w:val="20"/>
+              </w:rPr>
+              <w:t xml:space="preserve">0,94</w:t>
+            </w:r>
+          </w:p>
+        </w:tc>
+        <w:tc>
+          <w:tcPr>
+            <w:tcW w:type="dxa" w:w="2000"/>
+            <w:tcBorders>
+              <w:top w:val="single" w:color="A6A6A6" w:sz="4"/>
+              <w:left w:val="single" w:color="A6A6A6" w:sz="4"/>
+              <w:bottom w:val="single" w:color="A6A6A6" w:sz="4"/>
+              <w:right w:val="single" w:color="A6A6A6" w:sz="4"/>
+            </w:tcBorders>
+            <w:tcMar>
+              <w:top w:type="dxa" w:w="60"/>
+              <w:left w:type="dxa" w:w="100"/>
+              <w:bottom w:type="dxa" w:w="60"/>
+              <w:right w:type="dxa" w:w="100"/>
+            </w:tcMar>
+          </w:tcPr>
+          <w:p>
+            <w:pPr>
+              <w:keepNext/>
+            </w:pPr>
+            <w:r>
+              <w:rPr>
+                <w:b w:val="false"/>
+                <w:bCs w:val="false"/>
+                <w:sz w:val="20"/>
+                <w:szCs w:val="20"/>
+              </w:rPr>
+              <w:t xml:space="preserve">0,95</w:t>
+            </w:r>
+          </w:p>
+        </w:tc>
+      </w:tr>
+      <w:tr>
+        <w:trPr>
+          <w:cantSplit/>
+        </w:trPr>
+        <w:tc>
+          <w:tcPr>
+            <w:tcW w:type="dxa" w:w="5026"/>
+            <w:tcBorders>
+              <w:top w:val="single" w:color="A6A6A6" w:sz="4"/>
+              <w:left w:val="single" w:color="A6A6A6" w:sz="4"/>
+              <w:bottom w:val="single" w:color="A6A6A6" w:sz="4"/>
+              <w:right w:val="single" w:color="A6A6A6" w:sz="4"/>
+            </w:tcBorders>
+            <w:tcMar>
+              <w:top w:type="dxa" w:w="60"/>
+              <w:left w:type="dxa" w:w="100"/>
+              <w:bottom w:type="dxa" w:w="60"/>
+              <w:right w:type="dxa" w:w="100"/>
+            </w:tcMar>
+          </w:tcPr>
+          <w:p>
+            <w:pPr>
+              <w:keepNext/>
+            </w:pPr>
+            <w:r>
+              <w:rPr>
+                <w:b w:val="false"/>
+                <w:bCs w:val="false"/>
+                <w:sz w:val="20"/>
+                <w:szCs w:val="20"/>
+              </w:rPr>
+              <w:t xml:space="preserve">Έξοδος MLP – έξοδος TabNet</w:t>
+            </w:r>
+          </w:p>
+        </w:tc>
+        <w:tc>
+          <w:tcPr>
+            <w:tcW w:type="dxa" w:w="2000"/>
+            <w:tcBorders>
+              <w:top w:val="single" w:color="A6A6A6" w:sz="4"/>
+              <w:left w:val="single" w:color="A6A6A6" w:sz="4"/>
+              <w:bottom w:val="single" w:color="A6A6A6" w:sz="4"/>
+              <w:right w:val="single" w:color="A6A6A6" w:sz="4"/>
+            </w:tcBorders>
+            <w:tcMar>
+              <w:top w:type="dxa" w:w="60"/>
+              <w:left w:type="dxa" w:w="100"/>
+              <w:bottom w:type="dxa" w:w="60"/>
+              <w:right w:type="dxa" w:w="100"/>
+            </w:tcMar>
+          </w:tcPr>
+          <w:p>
+            <w:pPr>
+              <w:keepNext/>
+            </w:pPr>
+            <w:r>
+              <w:rPr>
+                <w:b w:val="false"/>
+                <w:bCs w:val="false"/>
+                <w:sz w:val="20"/>
+                <w:szCs w:val="20"/>
+              </w:rPr>
+              <w:t xml:space="preserve">0,83</w:t>
+            </w:r>
+          </w:p>
+        </w:tc>
+        <w:tc>
+          <w:tcPr>
+            <w:tcW w:type="dxa" w:w="2000"/>
+            <w:tcBorders>
+              <w:top w:val="single" w:color="A6A6A6" w:sz="4"/>
+              <w:left w:val="single" w:color="A6A6A6" w:sz="4"/>
+              <w:bottom w:val="single" w:color="A6A6A6" w:sz="4"/>
+              <w:right w:val="single" w:color="A6A6A6" w:sz="4"/>
+            </w:tcBorders>
+            <w:tcMar>
+              <w:top w:type="dxa" w:w="60"/>
+              <w:left w:type="dxa" w:w="100"/>
+              <w:bottom w:type="dxa" w:w="60"/>
+              <w:right w:type="dxa" w:w="100"/>
+            </w:tcMar>
+          </w:tcPr>
+          <w:p>
+            <w:pPr>
+              <w:keepNext/>
+            </w:pPr>
+            <w:r>
+              <w:rPr>
+                <w:b w:val="false"/>
+                <w:bCs w:val="false"/>
+                <w:sz w:val="20"/>
+                <w:szCs w:val="20"/>
+              </w:rPr>
+              <w:t xml:space="preserve">0,77</w:t>
+            </w:r>
+          </w:p>
+        </w:tc>
+      </w:tr>
+      <w:tr>
+        <w:trPr>
+          <w:cantSplit/>
+        </w:trPr>
+        <w:tc>
+          <w:tcPr>
+            <w:tcW w:type="dxa" w:w="5026"/>
+            <w:tcBorders>
+              <w:top w:val="single" w:color="A6A6A6" w:sz="4"/>
+              <w:left w:val="single" w:color="A6A6A6" w:sz="4"/>
+              <w:bottom w:val="single" w:color="A6A6A6" w:sz="4"/>
+              <w:right w:val="single" w:color="A6A6A6" w:sz="4"/>
+            </w:tcBorders>
+            <w:tcMar>
+              <w:top w:type="dxa" w:w="60"/>
+              <w:left w:type="dxa" w:w="100"/>
+              <w:bottom w:type="dxa" w:w="60"/>
+              <w:right w:type="dxa" w:w="100"/>
+            </w:tcMar>
+          </w:tcPr>
+          <w:p>
+            <w:pPr>
+              <w:keepNext w:val="false"/>
+            </w:pPr>
+            <w:r>
+              <w:rPr>
+                <w:b w:val="false"/>
+                <w:bCs w:val="false"/>
+                <w:sz w:val="20"/>
+                <w:szCs w:val="20"/>
+              </w:rPr>
+              <w:t xml:space="preserve">Έξοδος MLP – έξοδος Autoencoder</w:t>
+            </w:r>
+          </w:p>
+        </w:tc>
+        <w:tc>
+          <w:tcPr>
+            <w:tcW w:type="dxa" w:w="2000"/>
+            <w:tcBorders>
+              <w:top w:val="single" w:color="A6A6A6" w:sz="4"/>
+              <w:left w:val="single" w:color="A6A6A6" w:sz="4"/>
+              <w:bottom w:val="single" w:color="A6A6A6" w:sz="4"/>
+              <w:right w:val="single" w:color="A6A6A6" w:sz="4"/>
+            </w:tcBorders>
+            <w:tcMar>
+              <w:top w:type="dxa" w:w="60"/>
+              <w:left w:type="dxa" w:w="100"/>
+              <w:bottom w:type="dxa" w:w="60"/>
+              <w:right w:type="dxa" w:w="100"/>
+            </w:tcMar>
+          </w:tcPr>
+          <w:p>
+            <w:pPr>
+              <w:keepNext w:val="false"/>
+            </w:pPr>
+            <w:r>
+              <w:rPr>
+                <w:b w:val="false"/>
+                <w:bCs w:val="false"/>
+                <w:sz w:val="20"/>
+                <w:szCs w:val="20"/>
+              </w:rPr>
+              <w:t xml:space="preserve">0,42</w:t>
+            </w:r>
+          </w:p>
+        </w:tc>
+        <w:tc>
+          <w:tcPr>
+            <w:tcW w:type="dxa" w:w="2000"/>
+            <w:tcBorders>
+              <w:top w:val="single" w:color="A6A6A6" w:sz="4"/>
+              <w:left w:val="single" w:color="A6A6A6" w:sz="4"/>
+              <w:bottom w:val="single" w:color="A6A6A6" w:sz="4"/>
+              <w:right w:val="single" w:color="A6A6A6" w:sz="4"/>
+            </w:tcBorders>
+            <w:tcMar>
+              <w:top w:type="dxa" w:w="60"/>
+              <w:left w:type="dxa" w:w="100"/>
+              <w:bottom w:type="dxa" w:w="60"/>
+              <w:right w:type="dxa" w:w="100"/>
+            </w:tcMar>
+          </w:tcPr>
+          <w:p>
+            <w:pPr>
+              <w:keepNext w:val="false"/>
+            </w:pPr>
+            <w:r>
+              <w:rPr>
+                <w:b w:val="false"/>
+                <w:bCs w:val="false"/>
+                <w:sz w:val="20"/>
+                <w:szCs w:val="20"/>
+              </w:rPr>
+              <w:t xml:space="preserve">0,93</w:t>
+            </w:r>
+          </w:p>
+        </w:tc>
+      </w:tr>
+    </w:tbl>
+    <w:p>
+      <w:pPr>
+        <w:spacing w:after="120"/>
+      </w:pPr>
     </w:p>
     <w:p>
       <w:pPr>
@@ -11021,7 +12688,7 @@
         <w:spacing w:after="80"/>
       </w:pPr>
       <w:r>
-        <w:t xml:space="preserve">Στο TabNet, το test set χρησιμοποιήθηκε και ως eval_set για το early stopping, και οι ρυθμίσεις του άλλαξαν μετά την αποτυχημένη πρώτη εκτέλεση. Το αποτέλεσμα του Coimbra πρέπει να διαβαστεί με αυτή την επιφύλαξη.</w:t>
+        <w:t xml:space="preserve">MLP: το πρώτο κρυφό στρώμα μοιάζει με την είσοδο (0,81–0,84). Στο Coimbra η αναπαράσταση απομακρύνεται σταδιακά από την είσοδο και πλησιάζει την έξοδο. Στο WDBC τα δύο κρυφά στρώματα είναι σχεδόν ίδια (0,99), άρα το δεύτερο στρώμα δεν προσθέτει νέα γεωμετρία. Αυτό ταιριάζει με το ότι η Logistic Regression έφτασε το MLP στο cross-validation του WDBC (97,4% και 97,7%), αλλά δεν έχω ελέγξει τη σύνδεση.</w:t>
       </w:r>
     </w:p>
     <w:p>
@@ -11034,7 +12701,7 @@
         <w:spacing w:after="80"/>
       </w:pPr>
       <w:r>
-        <w:t xml:space="preserve">Το test set του Coimbra έχει μόνο 24 δείγματα: ένα δείγμα διαφορά αλλάζει το Accuracy κατά περίπου 4 ποσοστιαίες μονάδες. Οι διαφορές της τάξης των 8 μονάδων ανάμεσα σε μοντέλα είναι αδύναμη ένδειξη.</w:t>
+        <w:t xml:space="preserve">Autoencoder: το bottleneck κρατά το 0,88 της εισόδου στο Coimbra (7 από 9 διαστάσεις) και μόνο το 0,57 στο WDBC (3 από 30). Στο WDBC το εσωτερικό του διαφέρει πολύ από του MLP (0,27), αλλά η έξοδος είναι σχεδόν ίδια (0,93). Στο Coimbra η έξοδός του διαφέρει από των άλλων μοντέλων (0,38–0,42). Αυτό είναι συμβατό με το ότι ο Autoencoder ήταν ο πιο αδύναμος στον πρώτο χωρισμό του Coimbra, αλλά δεν αποδεικνύει αιτιότητα.</w:t>
       </w:r>
     </w:p>
     <w:p>
@@ -11047,7 +12714,7 @@
         <w:spacing w:after="80"/>
       </w:pPr>
       <w:r>
-        <w:t xml:space="preserve">Στους πίνακες με έναν χωρισμό έγινε μία μόνο εκτέλεση ανά μοντέλο (random_state=42), χωρίς απόκλιση. Αυτό καλύπτεται από το cross-validation.</w:t>
+        <w:t xml:space="preserve">TabNet: τα δύο βήματα έχουν μεταξύ τους πολύ χαμηλό CKA (0,04 και 0,16), δηλαδή κάθε βήμα φτιάχνει διαφορετική αναπαράσταση. Στο Coimbra η τιμή 0,04 είναι στο επίπεδο του τυχαίου θορύβου (0,057). Το άθροισμα των βημάτων (decision) και η έξοδος ταιριάζουν σχεδόν απόλυτα (0,94–0,96). Το εσωτερικό του TabNet απέχει από το MLP (0,17–0,56), αλλά οι έξοδοι ταιριάζουν (0,77–0,83).</w:t>
       </w:r>
     </w:p>
     <w:p>
@@ -11060,8 +12727,1343 @@
         <w:spacing w:after="80"/>
       </w:pPr>
       <w:r>
-        <w:t xml:space="preserve">Στο cross-validation: το TabNet έχει σταθερές ρυθμίσεις που επέλεξα νωρίτερα βλέποντας το test του πρώτου χωρισμού, και στο Coimbra κάνει early stopping σε πολύ μικρό validation set. Τα κλασικά μοντέλα έτρεξαν χωρίς tuning. Έγινε μία μόνο επανάληψη 5-fold (ένα random_state), οπότε και οι μέσοι όροι έχουν κάποια αβεβαιότητα.</w:t>
+        <w:t xml:space="preserve">Το CKA δείχνει ότι δύο αναπαραστάσεις μοιάζουν ή διαφέρουν. Δεν δείχνει ποια είναι καλύτερη.</w:t>
       </w:r>
+    </w:p>
+    <w:p>
+      <w:pPr>
+        <w:pStyle w:val="Heading1"/>
+      </w:pPr>
+      <w:r>
+        <w:t xml:space="preserve">Layer-wise Relevance Propagation (LRP) στο MLP</w:t>
+      </w:r>
+    </w:p>
+    <w:p>
+      <w:pPr>
+        <w:spacing w:after="120"/>
+      </w:pPr>
+      <w:r>
+        <w:t xml:space="preserve">Η δεύτερη τεχνική που ζήτησε ο επιβλέπων είναι το LRP (Layer-wise Relevance Propagation, Bach et al., PLOS ONE 2015). Παίρνει την έξοδο του δικτύου για ένα δείγμα (εδώ το logit της κλάσης 1) και τη μοιράζει προς τα πίσω, στρώμα προς στρώμα, μέχρι τα χαρακτηριστικά εισόδου. Για κάθε χαρακτηριστικό και κάθε δείγμα βγαίνει ένας αριθμός: θετικός σημαίνει υπέρ της κλάσης 1 και αρνητικός κατά. Η καθολική σημαντικότητα είναι ο μέσος όρος των απόλυτων τιμών, όπως στο SHAP.</w:t>
+      </w:r>
+    </w:p>
+    <w:p>
+      <w:pPr>
+        <w:spacing w:after="120"/>
+      </w:pPr>
+      <w:r>
+        <w:t xml:space="preserve">Εφαρμόστηκε μόνο στο MLP (με ένα και με δύο κρυφά στρώματα), γιατί χρειάζεται δίκτυο με γνωστά στρώματα και βάρη (script lrp_analysis.py). Δεν εφαρμόστηκε στα υπόλοιπα μοντέλα. Χρησιμοποίησα δύο κανόνες: το LRP-epsilon και το LRP-gamma (γ = 0,25). Στο LRP-gamma ο κανόνας γάμμα εφαρμόζεται στα κρυφά στρώματα (εκεί οι ενεργοποιήσεις είναι ReLU, άρα ≥ 0) και ο κανόνας epsilon στο πρώτο στρώμα, όπου η είσοδος είναι τυποποιημένα χαρακτηριστικά με πιθανές αρνητικές τιμές. Αυτή η επιλογή είναι δική μου. Οι τιμές υπολογίστηκαν στα ίδια δείγματα test με το SHAP και το LIME (24 στο Coimbra, 40 από τα 114 στο WDBC).</w:t>
+      </w:r>
+    </w:p>
+    <w:p>
+      <w:pPr>
+        <w:spacing w:after="120"/>
+      </w:pPr>
+      <w:r>
+        <w:t xml:space="preserve">Έλεγχοι ορθότητας: η έξοδος που υπολογίζει το script διαφέρει από το predict_proba του sklearn το πολύ 1,4·10⁻¹⁷, και το LRP-epsilon διαφέρει από το Gradient × Input το πολύ 2,7·10⁻⁷. Η ταύτιση με το Gradient × Input είναι γνωστό αποτέλεσμα για δίκτυα ReLU (Ancona et al., ICLR 2018), άρα το LRP-epsilon δεν προσθέτει κάτι πέρα από αυτή τη μέθοδο. Το LRP-gamma είναι διαφορετικός κανόνας.</w:t>
+      </w:r>
+    </w:p>
+    <w:p>
+      <w:pPr>
+        <w:pStyle w:val="Heading2"/>
+      </w:pPr>
+      <w:r>
+        <w:t xml:space="preserve">Top-5 χαρακτηριστικά του MLP (ένα κρυφό στρώμα)</w:t>
+      </w:r>
+    </w:p>
+    <w:tbl>
+      <w:tblPr>
+        <w:tblW w:type="dxa" w:w="9026"/>
+        <w:tblBorders>
+          <w:top w:val="single" w:color="auto" w:sz="4"/>
+          <w:left w:val="single" w:color="auto" w:sz="4"/>
+          <w:bottom w:val="single" w:color="auto" w:sz="4"/>
+          <w:right w:val="single" w:color="auto" w:sz="4"/>
+          <w:insideH w:val="single" w:color="auto" w:sz="4"/>
+          <w:insideV w:val="single" w:color="auto" w:sz="4"/>
+        </w:tblBorders>
+      </w:tblPr>
+      <w:tblGrid>
+        <w:gridCol w:w="1800"/>
+        <w:gridCol w:w="3613"/>
+        <w:gridCol w:w="3613"/>
+      </w:tblGrid>
+      <w:tr>
+        <w:trPr>
+          <w:tblHeader/>
+        </w:trPr>
+        <w:tc>
+          <w:tcPr>
+            <w:tcW w:type="dxa" w:w="1800"/>
+            <w:tcBorders>
+              <w:top w:val="single" w:color="A6A6A6" w:sz="4"/>
+              <w:left w:val="single" w:color="A6A6A6" w:sz="4"/>
+              <w:bottom w:val="single" w:color="A6A6A6" w:sz="4"/>
+              <w:right w:val="single" w:color="A6A6A6" w:sz="4"/>
+            </w:tcBorders>
+            <w:shd w:fill="DCE9F1" w:color="auto" w:val="clear"/>
+            <w:tcMar>
+              <w:top w:type="dxa" w:w="60"/>
+              <w:left w:type="dxa" w:w="100"/>
+              <w:bottom w:type="dxa" w:w="60"/>
+              <w:right w:type="dxa" w:w="100"/>
+            </w:tcMar>
+          </w:tcPr>
+          <w:p>
+            <w:pPr>
+              <w:keepNext/>
+            </w:pPr>
+            <w:r>
+              <w:rPr>
+                <w:b/>
+                <w:bCs/>
+                <w:sz w:val="20"/>
+                <w:szCs w:val="20"/>
+              </w:rPr>
+              <w:t xml:space="preserve">Τεχνική</w:t>
+            </w:r>
+          </w:p>
+        </w:tc>
+        <w:tc>
+          <w:tcPr>
+            <w:tcW w:type="dxa" w:w="3613"/>
+            <w:tcBorders>
+              <w:top w:val="single" w:color="A6A6A6" w:sz="4"/>
+              <w:left w:val="single" w:color="A6A6A6" w:sz="4"/>
+              <w:bottom w:val="single" w:color="A6A6A6" w:sz="4"/>
+              <w:right w:val="single" w:color="A6A6A6" w:sz="4"/>
+            </w:tcBorders>
+            <w:shd w:fill="DCE9F1" w:color="auto" w:val="clear"/>
+            <w:tcMar>
+              <w:top w:type="dxa" w:w="60"/>
+              <w:left w:type="dxa" w:w="100"/>
+              <w:bottom w:type="dxa" w:w="60"/>
+              <w:right w:type="dxa" w:w="100"/>
+            </w:tcMar>
+          </w:tcPr>
+          <w:p>
+            <w:pPr>
+              <w:keepNext/>
+            </w:pPr>
+            <w:r>
+              <w:rPr>
+                <w:b/>
+                <w:bCs/>
+                <w:sz w:val="20"/>
+                <w:szCs w:val="20"/>
+              </w:rPr>
+              <w:t xml:space="preserve">Coimbra</w:t>
+            </w:r>
+          </w:p>
+        </w:tc>
+        <w:tc>
+          <w:tcPr>
+            <w:tcW w:type="dxa" w:w="3613"/>
+            <w:tcBorders>
+              <w:top w:val="single" w:color="A6A6A6" w:sz="4"/>
+              <w:left w:val="single" w:color="A6A6A6" w:sz="4"/>
+              <w:bottom w:val="single" w:color="A6A6A6" w:sz="4"/>
+              <w:right w:val="single" w:color="A6A6A6" w:sz="4"/>
+            </w:tcBorders>
+            <w:shd w:fill="DCE9F1" w:color="auto" w:val="clear"/>
+            <w:tcMar>
+              <w:top w:type="dxa" w:w="60"/>
+              <w:left w:type="dxa" w:w="100"/>
+              <w:bottom w:type="dxa" w:w="60"/>
+              <w:right w:type="dxa" w:w="100"/>
+            </w:tcMar>
+          </w:tcPr>
+          <w:p>
+            <w:pPr>
+              <w:keepNext/>
+            </w:pPr>
+            <w:r>
+              <w:rPr>
+                <w:b/>
+                <w:bCs/>
+                <w:sz w:val="20"/>
+                <w:szCs w:val="20"/>
+              </w:rPr>
+              <w:t xml:space="preserve">WDBC</w:t>
+            </w:r>
+          </w:p>
+        </w:tc>
+      </w:tr>
+      <w:tr>
+        <w:trPr>
+          <w:cantSplit/>
+        </w:trPr>
+        <w:tc>
+          <w:tcPr>
+            <w:tcW w:type="dxa" w:w="1800"/>
+            <w:tcBorders>
+              <w:top w:val="single" w:color="A6A6A6" w:sz="4"/>
+              <w:left w:val="single" w:color="A6A6A6" w:sz="4"/>
+              <w:bottom w:val="single" w:color="A6A6A6" w:sz="4"/>
+              <w:right w:val="single" w:color="A6A6A6" w:sz="4"/>
+            </w:tcBorders>
+            <w:tcMar>
+              <w:top w:type="dxa" w:w="60"/>
+              <w:left w:type="dxa" w:w="100"/>
+              <w:bottom w:type="dxa" w:w="60"/>
+              <w:right w:type="dxa" w:w="100"/>
+            </w:tcMar>
+          </w:tcPr>
+          <w:p>
+            <w:pPr>
+              <w:keepNext/>
+            </w:pPr>
+            <w:r>
+              <w:rPr>
+                <w:b w:val="false"/>
+                <w:bCs w:val="false"/>
+                <w:sz w:val="20"/>
+                <w:szCs w:val="20"/>
+              </w:rPr>
+              <w:t xml:space="preserve">LRP-epsilon</w:t>
+            </w:r>
+          </w:p>
+        </w:tc>
+        <w:tc>
+          <w:tcPr>
+            <w:tcW w:type="dxa" w:w="3613"/>
+            <w:tcBorders>
+              <w:top w:val="single" w:color="A6A6A6" w:sz="4"/>
+              <w:left w:val="single" w:color="A6A6A6" w:sz="4"/>
+              <w:bottom w:val="single" w:color="A6A6A6" w:sz="4"/>
+              <w:right w:val="single" w:color="A6A6A6" w:sz="4"/>
+            </w:tcBorders>
+            <w:tcMar>
+              <w:top w:type="dxa" w:w="60"/>
+              <w:left w:type="dxa" w:w="100"/>
+              <w:bottom w:type="dxa" w:w="60"/>
+              <w:right w:type="dxa" w:w="100"/>
+            </w:tcMar>
+          </w:tcPr>
+          <w:p>
+            <w:pPr>
+              <w:keepNext/>
+            </w:pPr>
+            <w:r>
+              <w:rPr>
+                <w:b w:val="false"/>
+                <w:bCs w:val="false"/>
+                <w:sz w:val="20"/>
+                <w:szCs w:val="20"/>
+              </w:rPr>
+              <w:t xml:space="preserve">Glucose, Resistin, Leptin, Age, Adiponectin</w:t>
+            </w:r>
+          </w:p>
+        </w:tc>
+        <w:tc>
+          <w:tcPr>
+            <w:tcW w:type="dxa" w:w="3613"/>
+            <w:tcBorders>
+              <w:top w:val="single" w:color="A6A6A6" w:sz="4"/>
+              <w:left w:val="single" w:color="A6A6A6" w:sz="4"/>
+              <w:bottom w:val="single" w:color="A6A6A6" w:sz="4"/>
+              <w:right w:val="single" w:color="A6A6A6" w:sz="4"/>
+            </w:tcBorders>
+            <w:tcMar>
+              <w:top w:type="dxa" w:w="60"/>
+              <w:left w:type="dxa" w:w="100"/>
+              <w:bottom w:type="dxa" w:w="60"/>
+              <w:right w:type="dxa" w:w="100"/>
+            </w:tcMar>
+          </w:tcPr>
+          <w:p>
+            <w:pPr>
+              <w:keepNext/>
+            </w:pPr>
+            <w:r>
+              <w:rPr>
+                <w:b w:val="false"/>
+                <w:bCs w:val="false"/>
+                <w:sz w:val="20"/>
+                <w:szCs w:val="20"/>
+              </w:rPr>
+              <w:t xml:space="preserve">worst smoothness, mean radius, worst texture, worst perimeter, perimeter error</w:t>
+            </w:r>
+          </w:p>
+        </w:tc>
+      </w:tr>
+      <w:tr>
+        <w:trPr>
+          <w:cantSplit/>
+        </w:trPr>
+        <w:tc>
+          <w:tcPr>
+            <w:tcW w:type="dxa" w:w="1800"/>
+            <w:tcBorders>
+              <w:top w:val="single" w:color="A6A6A6" w:sz="4"/>
+              <w:left w:val="single" w:color="A6A6A6" w:sz="4"/>
+              <w:bottom w:val="single" w:color="A6A6A6" w:sz="4"/>
+              <w:right w:val="single" w:color="A6A6A6" w:sz="4"/>
+            </w:tcBorders>
+            <w:tcMar>
+              <w:top w:type="dxa" w:w="60"/>
+              <w:left w:type="dxa" w:w="100"/>
+              <w:bottom w:type="dxa" w:w="60"/>
+              <w:right w:type="dxa" w:w="100"/>
+            </w:tcMar>
+          </w:tcPr>
+          <w:p>
+            <w:pPr>
+              <w:keepNext/>
+            </w:pPr>
+            <w:r>
+              <w:rPr>
+                <w:b w:val="false"/>
+                <w:bCs w:val="false"/>
+                <w:sz w:val="20"/>
+                <w:szCs w:val="20"/>
+              </w:rPr>
+              <w:t xml:space="preserve">LRP-gamma</w:t>
+            </w:r>
+          </w:p>
+        </w:tc>
+        <w:tc>
+          <w:tcPr>
+            <w:tcW w:type="dxa" w:w="3613"/>
+            <w:tcBorders>
+              <w:top w:val="single" w:color="A6A6A6" w:sz="4"/>
+              <w:left w:val="single" w:color="A6A6A6" w:sz="4"/>
+              <w:bottom w:val="single" w:color="A6A6A6" w:sz="4"/>
+              <w:right w:val="single" w:color="A6A6A6" w:sz="4"/>
+            </w:tcBorders>
+            <w:tcMar>
+              <w:top w:type="dxa" w:w="60"/>
+              <w:left w:type="dxa" w:w="100"/>
+              <w:bottom w:type="dxa" w:w="60"/>
+              <w:right w:type="dxa" w:w="100"/>
+            </w:tcMar>
+          </w:tcPr>
+          <w:p>
+            <w:pPr>
+              <w:keepNext/>
+            </w:pPr>
+            <w:r>
+              <w:rPr>
+                <w:b w:val="false"/>
+                <w:bCs w:val="false"/>
+                <w:sz w:val="20"/>
+                <w:szCs w:val="20"/>
+              </w:rPr>
+              <w:t xml:space="preserve">Glucose, Resistin, Adiponectin, Age, Leptin</w:t>
+            </w:r>
+          </w:p>
+        </w:tc>
+        <w:tc>
+          <w:tcPr>
+            <w:tcW w:type="dxa" w:w="3613"/>
+            <w:tcBorders>
+              <w:top w:val="single" w:color="A6A6A6" w:sz="4"/>
+              <w:left w:val="single" w:color="A6A6A6" w:sz="4"/>
+              <w:bottom w:val="single" w:color="A6A6A6" w:sz="4"/>
+              <w:right w:val="single" w:color="A6A6A6" w:sz="4"/>
+            </w:tcBorders>
+            <w:tcMar>
+              <w:top w:type="dxa" w:w="60"/>
+              <w:left w:type="dxa" w:w="100"/>
+              <w:bottom w:type="dxa" w:w="60"/>
+              <w:right w:type="dxa" w:w="100"/>
+            </w:tcMar>
+          </w:tcPr>
+          <w:p>
+            <w:pPr>
+              <w:keepNext/>
+            </w:pPr>
+            <w:r>
+              <w:rPr>
+                <w:b w:val="false"/>
+                <w:bCs w:val="false"/>
+                <w:sz w:val="20"/>
+                <w:szCs w:val="20"/>
+              </w:rPr>
+              <w:t xml:space="preserve">mean radius, worst smoothness, worst texture, worst perimeter, perimeter error</w:t>
+            </w:r>
+          </w:p>
+        </w:tc>
+      </w:tr>
+      <w:tr>
+        <w:trPr>
+          <w:cantSplit/>
+        </w:trPr>
+        <w:tc>
+          <w:tcPr>
+            <w:tcW w:type="dxa" w:w="1800"/>
+            <w:tcBorders>
+              <w:top w:val="single" w:color="A6A6A6" w:sz="4"/>
+              <w:left w:val="single" w:color="A6A6A6" w:sz="4"/>
+              <w:bottom w:val="single" w:color="A6A6A6" w:sz="4"/>
+              <w:right w:val="single" w:color="A6A6A6" w:sz="4"/>
+            </w:tcBorders>
+            <w:tcMar>
+              <w:top w:type="dxa" w:w="60"/>
+              <w:left w:type="dxa" w:w="100"/>
+              <w:bottom w:type="dxa" w:w="60"/>
+              <w:right w:type="dxa" w:w="100"/>
+            </w:tcMar>
+          </w:tcPr>
+          <w:p>
+            <w:pPr>
+              <w:keepNext/>
+            </w:pPr>
+            <w:r>
+              <w:rPr>
+                <w:b w:val="false"/>
+                <w:bCs w:val="false"/>
+                <w:sz w:val="20"/>
+                <w:szCs w:val="20"/>
+              </w:rPr>
+              <w:t xml:space="preserve">SHAP</w:t>
+            </w:r>
+          </w:p>
+        </w:tc>
+        <w:tc>
+          <w:tcPr>
+            <w:tcW w:type="dxa" w:w="3613"/>
+            <w:tcBorders>
+              <w:top w:val="single" w:color="A6A6A6" w:sz="4"/>
+              <w:left w:val="single" w:color="A6A6A6" w:sz="4"/>
+              <w:bottom w:val="single" w:color="A6A6A6" w:sz="4"/>
+              <w:right w:val="single" w:color="A6A6A6" w:sz="4"/>
+            </w:tcBorders>
+            <w:tcMar>
+              <w:top w:type="dxa" w:w="60"/>
+              <w:left w:type="dxa" w:w="100"/>
+              <w:bottom w:type="dxa" w:w="60"/>
+              <w:right w:type="dxa" w:w="100"/>
+            </w:tcMar>
+          </w:tcPr>
+          <w:p>
+            <w:pPr>
+              <w:keepNext/>
+            </w:pPr>
+            <w:r>
+              <w:rPr>
+                <w:b w:val="false"/>
+                <w:bCs w:val="false"/>
+                <w:sz w:val="20"/>
+                <w:szCs w:val="20"/>
+              </w:rPr>
+              <w:t xml:space="preserve">Glucose, Resistin, BMI, Age, MCP.1</w:t>
+            </w:r>
+          </w:p>
+        </w:tc>
+        <w:tc>
+          <w:tcPr>
+            <w:tcW w:type="dxa" w:w="3613"/>
+            <w:tcBorders>
+              <w:top w:val="single" w:color="A6A6A6" w:sz="4"/>
+              <w:left w:val="single" w:color="A6A6A6" w:sz="4"/>
+              <w:bottom w:val="single" w:color="A6A6A6" w:sz="4"/>
+              <w:right w:val="single" w:color="A6A6A6" w:sz="4"/>
+            </w:tcBorders>
+            <w:tcMar>
+              <w:top w:type="dxa" w:w="60"/>
+              <w:left w:type="dxa" w:w="100"/>
+              <w:bottom w:type="dxa" w:w="60"/>
+              <w:right w:type="dxa" w:w="100"/>
+            </w:tcMar>
+          </w:tcPr>
+          <w:p>
+            <w:pPr>
+              <w:keepNext/>
+            </w:pPr>
+            <w:r>
+              <w:rPr>
+                <w:b w:val="false"/>
+                <w:bCs w:val="false"/>
+                <w:sz w:val="20"/>
+                <w:szCs w:val="20"/>
+              </w:rPr>
+              <w:t xml:space="preserve">mean radius, worst texture, worst smoothness, worst perimeter, perimeter error</w:t>
+            </w:r>
+          </w:p>
+        </w:tc>
+      </w:tr>
+      <w:tr>
+        <w:trPr>
+          <w:cantSplit/>
+        </w:trPr>
+        <w:tc>
+          <w:tcPr>
+            <w:tcW w:type="dxa" w:w="1800"/>
+            <w:tcBorders>
+              <w:top w:val="single" w:color="A6A6A6" w:sz="4"/>
+              <w:left w:val="single" w:color="A6A6A6" w:sz="4"/>
+              <w:bottom w:val="single" w:color="A6A6A6" w:sz="4"/>
+              <w:right w:val="single" w:color="A6A6A6" w:sz="4"/>
+            </w:tcBorders>
+            <w:tcMar>
+              <w:top w:type="dxa" w:w="60"/>
+              <w:left w:type="dxa" w:w="100"/>
+              <w:bottom w:type="dxa" w:w="60"/>
+              <w:right w:type="dxa" w:w="100"/>
+            </w:tcMar>
+          </w:tcPr>
+          <w:p>
+            <w:pPr>
+              <w:keepNext/>
+            </w:pPr>
+            <w:r>
+              <w:rPr>
+                <w:b w:val="false"/>
+                <w:bCs w:val="false"/>
+                <w:sz w:val="20"/>
+                <w:szCs w:val="20"/>
+              </w:rPr>
+              <w:t xml:space="preserve">LIME</w:t>
+            </w:r>
+          </w:p>
+        </w:tc>
+        <w:tc>
+          <w:tcPr>
+            <w:tcW w:type="dxa" w:w="3613"/>
+            <w:tcBorders>
+              <w:top w:val="single" w:color="A6A6A6" w:sz="4"/>
+              <w:left w:val="single" w:color="A6A6A6" w:sz="4"/>
+              <w:bottom w:val="single" w:color="A6A6A6" w:sz="4"/>
+              <w:right w:val="single" w:color="A6A6A6" w:sz="4"/>
+            </w:tcBorders>
+            <w:tcMar>
+              <w:top w:type="dxa" w:w="60"/>
+              <w:left w:type="dxa" w:w="100"/>
+              <w:bottom w:type="dxa" w:w="60"/>
+              <w:right w:type="dxa" w:w="100"/>
+            </w:tcMar>
+          </w:tcPr>
+          <w:p>
+            <w:pPr>
+              <w:keepNext/>
+            </w:pPr>
+            <w:r>
+              <w:rPr>
+                <w:b w:val="false"/>
+                <w:bCs w:val="false"/>
+                <w:sz w:val="20"/>
+                <w:szCs w:val="20"/>
+              </w:rPr>
+              <w:t xml:space="preserve">Glucose, Resistin, BMI, MCP.1, Adiponectin</w:t>
+            </w:r>
+          </w:p>
+        </w:tc>
+        <w:tc>
+          <w:tcPr>
+            <w:tcW w:type="dxa" w:w="3613"/>
+            <w:tcBorders>
+              <w:top w:val="single" w:color="A6A6A6" w:sz="4"/>
+              <w:left w:val="single" w:color="A6A6A6" w:sz="4"/>
+              <w:bottom w:val="single" w:color="A6A6A6" w:sz="4"/>
+              <w:right w:val="single" w:color="A6A6A6" w:sz="4"/>
+            </w:tcBorders>
+            <w:tcMar>
+              <w:top w:type="dxa" w:w="60"/>
+              <w:left w:type="dxa" w:w="100"/>
+              <w:bottom w:type="dxa" w:w="60"/>
+              <w:right w:type="dxa" w:w="100"/>
+            </w:tcMar>
+          </w:tcPr>
+          <w:p>
+            <w:pPr>
+              <w:keepNext/>
+            </w:pPr>
+            <w:r>
+              <w:rPr>
+                <w:b w:val="false"/>
+                <w:bCs w:val="false"/>
+                <w:sz w:val="20"/>
+                <w:szCs w:val="20"/>
+              </w:rPr>
+              <w:t xml:space="preserve">mean radius, worst smoothness, perimeter error, worst texture, worst perimeter</w:t>
+            </w:r>
+          </w:p>
+        </w:tc>
+      </w:tr>
+      <w:tr>
+        <w:trPr>
+          <w:cantSplit/>
+        </w:trPr>
+        <w:tc>
+          <w:tcPr>
+            <w:tcW w:type="dxa" w:w="1800"/>
+            <w:tcBorders>
+              <w:top w:val="single" w:color="A6A6A6" w:sz="4"/>
+              <w:left w:val="single" w:color="A6A6A6" w:sz="4"/>
+              <w:bottom w:val="single" w:color="A6A6A6" w:sz="4"/>
+              <w:right w:val="single" w:color="A6A6A6" w:sz="4"/>
+            </w:tcBorders>
+            <w:tcMar>
+              <w:top w:type="dxa" w:w="60"/>
+              <w:left w:type="dxa" w:w="100"/>
+              <w:bottom w:type="dxa" w:w="60"/>
+              <w:right w:type="dxa" w:w="100"/>
+            </w:tcMar>
+          </w:tcPr>
+          <w:p>
+            <w:pPr>
+              <w:keepNext w:val="false"/>
+            </w:pPr>
+            <w:r>
+              <w:rPr>
+                <w:b w:val="false"/>
+                <w:bCs w:val="false"/>
+                <w:sz w:val="20"/>
+                <w:szCs w:val="20"/>
+              </w:rPr>
+              <w:t xml:space="preserve">Permutation</w:t>
+            </w:r>
+          </w:p>
+        </w:tc>
+        <w:tc>
+          <w:tcPr>
+            <w:tcW w:type="dxa" w:w="3613"/>
+            <w:tcBorders>
+              <w:top w:val="single" w:color="A6A6A6" w:sz="4"/>
+              <w:left w:val="single" w:color="A6A6A6" w:sz="4"/>
+              <w:bottom w:val="single" w:color="A6A6A6" w:sz="4"/>
+              <w:right w:val="single" w:color="A6A6A6" w:sz="4"/>
+            </w:tcBorders>
+            <w:tcMar>
+              <w:top w:type="dxa" w:w="60"/>
+              <w:left w:type="dxa" w:w="100"/>
+              <w:bottom w:type="dxa" w:w="60"/>
+              <w:right w:type="dxa" w:w="100"/>
+            </w:tcMar>
+          </w:tcPr>
+          <w:p>
+            <w:pPr>
+              <w:keepNext w:val="false"/>
+            </w:pPr>
+            <w:r>
+              <w:rPr>
+                <w:b w:val="false"/>
+                <w:bCs w:val="false"/>
+                <w:sz w:val="20"/>
+                <w:szCs w:val="20"/>
+              </w:rPr>
+              <w:t xml:space="preserve">Resistin, Age, Glucose, BMI, Insulin</w:t>
+            </w:r>
+          </w:p>
+        </w:tc>
+        <w:tc>
+          <w:tcPr>
+            <w:tcW w:type="dxa" w:w="3613"/>
+            <w:tcBorders>
+              <w:top w:val="single" w:color="A6A6A6" w:sz="4"/>
+              <w:left w:val="single" w:color="A6A6A6" w:sz="4"/>
+              <w:bottom w:val="single" w:color="A6A6A6" w:sz="4"/>
+              <w:right w:val="single" w:color="A6A6A6" w:sz="4"/>
+            </w:tcBorders>
+            <w:tcMar>
+              <w:top w:type="dxa" w:w="60"/>
+              <w:left w:type="dxa" w:w="100"/>
+              <w:bottom w:type="dxa" w:w="60"/>
+              <w:right w:type="dxa" w:w="100"/>
+            </w:tcMar>
+          </w:tcPr>
+          <w:p>
+            <w:pPr>
+              <w:keepNext w:val="false"/>
+            </w:pPr>
+            <w:r>
+              <w:rPr>
+                <w:b w:val="false"/>
+                <w:bCs w:val="false"/>
+                <w:sz w:val="20"/>
+                <w:szCs w:val="20"/>
+              </w:rPr>
+              <w:t xml:space="preserve">worst smoothness, mean radius, perimeter error, worst perimeter, worst texture</w:t>
+            </w:r>
+          </w:p>
+        </w:tc>
+      </w:tr>
+    </w:tbl>
+    <w:p>
+      <w:pPr>
+        <w:spacing w:after="120"/>
+      </w:pPr>
+    </w:p>
+    <w:p>
+      <w:pPr>
+        <w:spacing w:after="120"/>
+      </w:pPr>
+      <w:r>
+        <w:t xml:space="preserve">Συμφωνία του LRP με τις άλλες τεχνικές (Spearman ρ / κοινά στο top-5):</w:t>
+      </w:r>
+    </w:p>
+    <w:tbl>
+      <w:tblPr>
+        <w:tblW w:type="dxa" w:w="9026"/>
+        <w:tblBorders>
+          <w:top w:val="single" w:color="auto" w:sz="4"/>
+          <w:left w:val="single" w:color="auto" w:sz="4"/>
+          <w:bottom w:val="single" w:color="auto" w:sz="4"/>
+          <w:right w:val="single" w:color="auto" w:sz="4"/>
+          <w:insideH w:val="single" w:color="auto" w:sz="4"/>
+          <w:insideV w:val="single" w:color="auto" w:sz="4"/>
+        </w:tblBorders>
+      </w:tblPr>
+      <w:tblGrid>
+        <w:gridCol w:w="3026"/>
+        <w:gridCol w:w="2000"/>
+        <w:gridCol w:w="2000"/>
+        <w:gridCol w:w="2000"/>
+      </w:tblGrid>
+      <w:tr>
+        <w:trPr>
+          <w:tblHeader/>
+        </w:trPr>
+        <w:tc>
+          <w:tcPr>
+            <w:tcW w:type="dxa" w:w="3026"/>
+            <w:tcBorders>
+              <w:top w:val="single" w:color="A6A6A6" w:sz="4"/>
+              <w:left w:val="single" w:color="A6A6A6" w:sz="4"/>
+              <w:bottom w:val="single" w:color="A6A6A6" w:sz="4"/>
+              <w:right w:val="single" w:color="A6A6A6" w:sz="4"/>
+            </w:tcBorders>
+            <w:shd w:fill="DCE9F1" w:color="auto" w:val="clear"/>
+            <w:tcMar>
+              <w:top w:type="dxa" w:w="60"/>
+              <w:left w:type="dxa" w:w="100"/>
+              <w:bottom w:type="dxa" w:w="60"/>
+              <w:right w:type="dxa" w:w="100"/>
+            </w:tcMar>
+          </w:tcPr>
+          <w:p>
+            <w:pPr>
+              <w:keepNext/>
+            </w:pPr>
+            <w:r>
+              <w:rPr>
+                <w:b/>
+                <w:bCs/>
+                <w:sz w:val="20"/>
+                <w:szCs w:val="20"/>
+              </w:rPr>
+              <w:t xml:space="preserve">Dataset και κανόνας</w:t>
+            </w:r>
+          </w:p>
+        </w:tc>
+        <w:tc>
+          <w:tcPr>
+            <w:tcW w:type="dxa" w:w="2000"/>
+            <w:tcBorders>
+              <w:top w:val="single" w:color="A6A6A6" w:sz="4"/>
+              <w:left w:val="single" w:color="A6A6A6" w:sz="4"/>
+              <w:bottom w:val="single" w:color="A6A6A6" w:sz="4"/>
+              <w:right w:val="single" w:color="A6A6A6" w:sz="4"/>
+            </w:tcBorders>
+            <w:shd w:fill="DCE9F1" w:color="auto" w:val="clear"/>
+            <w:tcMar>
+              <w:top w:type="dxa" w:w="60"/>
+              <w:left w:type="dxa" w:w="100"/>
+              <w:bottom w:type="dxa" w:w="60"/>
+              <w:right w:type="dxa" w:w="100"/>
+            </w:tcMar>
+          </w:tcPr>
+          <w:p>
+            <w:pPr>
+              <w:keepNext/>
+            </w:pPr>
+            <w:r>
+              <w:rPr>
+                <w:b/>
+                <w:bCs/>
+                <w:sz w:val="20"/>
+                <w:szCs w:val="20"/>
+              </w:rPr>
+              <w:t xml:space="preserve">SHAP</w:t>
+            </w:r>
+          </w:p>
+        </w:tc>
+        <w:tc>
+          <w:tcPr>
+            <w:tcW w:type="dxa" w:w="2000"/>
+            <w:tcBorders>
+              <w:top w:val="single" w:color="A6A6A6" w:sz="4"/>
+              <w:left w:val="single" w:color="A6A6A6" w:sz="4"/>
+              <w:bottom w:val="single" w:color="A6A6A6" w:sz="4"/>
+              <w:right w:val="single" w:color="A6A6A6" w:sz="4"/>
+            </w:tcBorders>
+            <w:shd w:fill="DCE9F1" w:color="auto" w:val="clear"/>
+            <w:tcMar>
+              <w:top w:type="dxa" w:w="60"/>
+              <w:left w:type="dxa" w:w="100"/>
+              <w:bottom w:type="dxa" w:w="60"/>
+              <w:right w:type="dxa" w:w="100"/>
+            </w:tcMar>
+          </w:tcPr>
+          <w:p>
+            <w:pPr>
+              <w:keepNext/>
+            </w:pPr>
+            <w:r>
+              <w:rPr>
+                <w:b/>
+                <w:bCs/>
+                <w:sz w:val="20"/>
+                <w:szCs w:val="20"/>
+              </w:rPr>
+              <w:t xml:space="preserve">LIME</w:t>
+            </w:r>
+          </w:p>
+        </w:tc>
+        <w:tc>
+          <w:tcPr>
+            <w:tcW w:type="dxa" w:w="2000"/>
+            <w:tcBorders>
+              <w:top w:val="single" w:color="A6A6A6" w:sz="4"/>
+              <w:left w:val="single" w:color="A6A6A6" w:sz="4"/>
+              <w:bottom w:val="single" w:color="A6A6A6" w:sz="4"/>
+              <w:right w:val="single" w:color="A6A6A6" w:sz="4"/>
+            </w:tcBorders>
+            <w:shd w:fill="DCE9F1" w:color="auto" w:val="clear"/>
+            <w:tcMar>
+              <w:top w:type="dxa" w:w="60"/>
+              <w:left w:type="dxa" w:w="100"/>
+              <w:bottom w:type="dxa" w:w="60"/>
+              <w:right w:type="dxa" w:w="100"/>
+            </w:tcMar>
+          </w:tcPr>
+          <w:p>
+            <w:pPr>
+              <w:keepNext/>
+            </w:pPr>
+            <w:r>
+              <w:rPr>
+                <w:b/>
+                <w:bCs/>
+                <w:sz w:val="20"/>
+                <w:szCs w:val="20"/>
+              </w:rPr>
+              <w:t xml:space="preserve">Permutation</w:t>
+            </w:r>
+          </w:p>
+        </w:tc>
+      </w:tr>
+      <w:tr>
+        <w:trPr>
+          <w:cantSplit/>
+        </w:trPr>
+        <w:tc>
+          <w:tcPr>
+            <w:tcW w:type="dxa" w:w="3026"/>
+            <w:tcBorders>
+              <w:top w:val="single" w:color="A6A6A6" w:sz="4"/>
+              <w:left w:val="single" w:color="A6A6A6" w:sz="4"/>
+              <w:bottom w:val="single" w:color="A6A6A6" w:sz="4"/>
+              <w:right w:val="single" w:color="A6A6A6" w:sz="4"/>
+            </w:tcBorders>
+            <w:tcMar>
+              <w:top w:type="dxa" w:w="60"/>
+              <w:left w:type="dxa" w:w="100"/>
+              <w:bottom w:type="dxa" w:w="60"/>
+              <w:right w:type="dxa" w:w="100"/>
+            </w:tcMar>
+          </w:tcPr>
+          <w:p>
+            <w:pPr>
+              <w:keepNext/>
+            </w:pPr>
+            <w:r>
+              <w:rPr>
+                <w:b w:val="false"/>
+                <w:bCs w:val="false"/>
+                <w:sz w:val="20"/>
+                <w:szCs w:val="20"/>
+              </w:rPr>
+              <w:t xml:space="preserve">Coimbra, LRP-epsilon</w:t>
+            </w:r>
+          </w:p>
+        </w:tc>
+        <w:tc>
+          <w:tcPr>
+            <w:tcW w:type="dxa" w:w="2000"/>
+            <w:tcBorders>
+              <w:top w:val="single" w:color="A6A6A6" w:sz="4"/>
+              <w:left w:val="single" w:color="A6A6A6" w:sz="4"/>
+              <w:bottom w:val="single" w:color="A6A6A6" w:sz="4"/>
+              <w:right w:val="single" w:color="A6A6A6" w:sz="4"/>
+            </w:tcBorders>
+            <w:tcMar>
+              <w:top w:type="dxa" w:w="60"/>
+              <w:left w:type="dxa" w:w="100"/>
+              <w:bottom w:type="dxa" w:w="60"/>
+              <w:right w:type="dxa" w:w="100"/>
+            </w:tcMar>
+          </w:tcPr>
+          <w:p>
+            <w:pPr>
+              <w:keepNext/>
+            </w:pPr>
+            <w:r>
+              <w:rPr>
+                <w:b w:val="false"/>
+                <w:bCs w:val="false"/>
+                <w:sz w:val="20"/>
+                <w:szCs w:val="20"/>
+              </w:rPr>
+              <w:t xml:space="preserve">0,75 / 3</w:t>
+            </w:r>
+          </w:p>
+        </w:tc>
+        <w:tc>
+          <w:tcPr>
+            <w:tcW w:type="dxa" w:w="2000"/>
+            <w:tcBorders>
+              <w:top w:val="single" w:color="A6A6A6" w:sz="4"/>
+              <w:left w:val="single" w:color="A6A6A6" w:sz="4"/>
+              <w:bottom w:val="single" w:color="A6A6A6" w:sz="4"/>
+              <w:right w:val="single" w:color="A6A6A6" w:sz="4"/>
+            </w:tcBorders>
+            <w:tcMar>
+              <w:top w:type="dxa" w:w="60"/>
+              <w:left w:type="dxa" w:w="100"/>
+              <w:bottom w:type="dxa" w:w="60"/>
+              <w:right w:type="dxa" w:w="100"/>
+            </w:tcMar>
+          </w:tcPr>
+          <w:p>
+            <w:pPr>
+              <w:keepNext/>
+            </w:pPr>
+            <w:r>
+              <w:rPr>
+                <w:b w:val="false"/>
+                <w:bCs w:val="false"/>
+                <w:sz w:val="20"/>
+                <w:szCs w:val="20"/>
+              </w:rPr>
+              <w:t xml:space="preserve">0,53 / 3</w:t>
+            </w:r>
+          </w:p>
+        </w:tc>
+        <w:tc>
+          <w:tcPr>
+            <w:tcW w:type="dxa" w:w="2000"/>
+            <w:tcBorders>
+              <w:top w:val="single" w:color="A6A6A6" w:sz="4"/>
+              <w:left w:val="single" w:color="A6A6A6" w:sz="4"/>
+              <w:bottom w:val="single" w:color="A6A6A6" w:sz="4"/>
+              <w:right w:val="single" w:color="A6A6A6" w:sz="4"/>
+            </w:tcBorders>
+            <w:tcMar>
+              <w:top w:type="dxa" w:w="60"/>
+              <w:left w:type="dxa" w:w="100"/>
+              <w:bottom w:type="dxa" w:w="60"/>
+              <w:right w:type="dxa" w:w="100"/>
+            </w:tcMar>
+          </w:tcPr>
+          <w:p>
+            <w:pPr>
+              <w:keepNext/>
+            </w:pPr>
+            <w:r>
+              <w:rPr>
+                <w:b w:val="false"/>
+                <w:bCs w:val="false"/>
+                <w:sz w:val="20"/>
+                <w:szCs w:val="20"/>
+              </w:rPr>
+              <w:t xml:space="preserve">0,67 / 3</w:t>
+            </w:r>
+          </w:p>
+        </w:tc>
+      </w:tr>
+      <w:tr>
+        <w:trPr>
+          <w:cantSplit/>
+        </w:trPr>
+        <w:tc>
+          <w:tcPr>
+            <w:tcW w:type="dxa" w:w="3026"/>
+            <w:tcBorders>
+              <w:top w:val="single" w:color="A6A6A6" w:sz="4"/>
+              <w:left w:val="single" w:color="A6A6A6" w:sz="4"/>
+              <w:bottom w:val="single" w:color="A6A6A6" w:sz="4"/>
+              <w:right w:val="single" w:color="A6A6A6" w:sz="4"/>
+            </w:tcBorders>
+            <w:tcMar>
+              <w:top w:type="dxa" w:w="60"/>
+              <w:left w:type="dxa" w:w="100"/>
+              <w:bottom w:type="dxa" w:w="60"/>
+              <w:right w:type="dxa" w:w="100"/>
+            </w:tcMar>
+          </w:tcPr>
+          <w:p>
+            <w:pPr>
+              <w:keepNext/>
+            </w:pPr>
+            <w:r>
+              <w:rPr>
+                <w:b w:val="false"/>
+                <w:bCs w:val="false"/>
+                <w:sz w:val="20"/>
+                <w:szCs w:val="20"/>
+              </w:rPr>
+              <w:t xml:space="preserve">Coimbra, LRP-gamma</w:t>
+            </w:r>
+          </w:p>
+        </w:tc>
+        <w:tc>
+          <w:tcPr>
+            <w:tcW w:type="dxa" w:w="2000"/>
+            <w:tcBorders>
+              <w:top w:val="single" w:color="A6A6A6" w:sz="4"/>
+              <w:left w:val="single" w:color="A6A6A6" w:sz="4"/>
+              <w:bottom w:val="single" w:color="A6A6A6" w:sz="4"/>
+              <w:right w:val="single" w:color="A6A6A6" w:sz="4"/>
+            </w:tcBorders>
+            <w:tcMar>
+              <w:top w:type="dxa" w:w="60"/>
+              <w:left w:type="dxa" w:w="100"/>
+              <w:bottom w:type="dxa" w:w="60"/>
+              <w:right w:type="dxa" w:w="100"/>
+            </w:tcMar>
+          </w:tcPr>
+          <w:p>
+            <w:pPr>
+              <w:keepNext/>
+            </w:pPr>
+            <w:r>
+              <w:rPr>
+                <w:b w:val="false"/>
+                <w:bCs w:val="false"/>
+                <w:sz w:val="20"/>
+                <w:szCs w:val="20"/>
+              </w:rPr>
+              <w:t xml:space="preserve">0,67 / 3</w:t>
+            </w:r>
+          </w:p>
+        </w:tc>
+        <w:tc>
+          <w:tcPr>
+            <w:tcW w:type="dxa" w:w="2000"/>
+            <w:tcBorders>
+              <w:top w:val="single" w:color="A6A6A6" w:sz="4"/>
+              <w:left w:val="single" w:color="A6A6A6" w:sz="4"/>
+              <w:bottom w:val="single" w:color="A6A6A6" w:sz="4"/>
+              <w:right w:val="single" w:color="A6A6A6" w:sz="4"/>
+            </w:tcBorders>
+            <w:tcMar>
+              <w:top w:type="dxa" w:w="60"/>
+              <w:left w:type="dxa" w:w="100"/>
+              <w:bottom w:type="dxa" w:w="60"/>
+              <w:right w:type="dxa" w:w="100"/>
+            </w:tcMar>
+          </w:tcPr>
+          <w:p>
+            <w:pPr>
+              <w:keepNext/>
+            </w:pPr>
+            <w:r>
+              <w:rPr>
+                <w:b w:val="false"/>
+                <w:bCs w:val="false"/>
+                <w:sz w:val="20"/>
+                <w:szCs w:val="20"/>
+              </w:rPr>
+              <w:t xml:space="preserve">0,52 / 3</w:t>
+            </w:r>
+          </w:p>
+        </w:tc>
+        <w:tc>
+          <w:tcPr>
+            <w:tcW w:type="dxa" w:w="2000"/>
+            <w:tcBorders>
+              <w:top w:val="single" w:color="A6A6A6" w:sz="4"/>
+              <w:left w:val="single" w:color="A6A6A6" w:sz="4"/>
+              <w:bottom w:val="single" w:color="A6A6A6" w:sz="4"/>
+              <w:right w:val="single" w:color="A6A6A6" w:sz="4"/>
+            </w:tcBorders>
+            <w:tcMar>
+              <w:top w:type="dxa" w:w="60"/>
+              <w:left w:type="dxa" w:w="100"/>
+              <w:bottom w:type="dxa" w:w="60"/>
+              <w:right w:type="dxa" w:w="100"/>
+            </w:tcMar>
+          </w:tcPr>
+          <w:p>
+            <w:pPr>
+              <w:keepNext/>
+            </w:pPr>
+            <w:r>
+              <w:rPr>
+                <w:b w:val="false"/>
+                <w:bCs w:val="false"/>
+                <w:sz w:val="20"/>
+                <w:szCs w:val="20"/>
+              </w:rPr>
+              <w:t xml:space="preserve">0,72 / 3</w:t>
+            </w:r>
+          </w:p>
+        </w:tc>
+      </w:tr>
+      <w:tr>
+        <w:trPr>
+          <w:cantSplit/>
+        </w:trPr>
+        <w:tc>
+          <w:tcPr>
+            <w:tcW w:type="dxa" w:w="3026"/>
+            <w:tcBorders>
+              <w:top w:val="single" w:color="A6A6A6" w:sz="4"/>
+              <w:left w:val="single" w:color="A6A6A6" w:sz="4"/>
+              <w:bottom w:val="single" w:color="A6A6A6" w:sz="4"/>
+              <w:right w:val="single" w:color="A6A6A6" w:sz="4"/>
+            </w:tcBorders>
+            <w:tcMar>
+              <w:top w:type="dxa" w:w="60"/>
+              <w:left w:type="dxa" w:w="100"/>
+              <w:bottom w:type="dxa" w:w="60"/>
+              <w:right w:type="dxa" w:w="100"/>
+            </w:tcMar>
+          </w:tcPr>
+          <w:p>
+            <w:pPr>
+              <w:keepNext/>
+            </w:pPr>
+            <w:r>
+              <w:rPr>
+                <w:b w:val="false"/>
+                <w:bCs w:val="false"/>
+                <w:sz w:val="20"/>
+                <w:szCs w:val="20"/>
+              </w:rPr>
+              <w:t xml:space="preserve">WDBC, LRP-epsilon</w:t>
+            </w:r>
+          </w:p>
+        </w:tc>
+        <w:tc>
+          <w:tcPr>
+            <w:tcW w:type="dxa" w:w="2000"/>
+            <w:tcBorders>
+              <w:top w:val="single" w:color="A6A6A6" w:sz="4"/>
+              <w:left w:val="single" w:color="A6A6A6" w:sz="4"/>
+              <w:bottom w:val="single" w:color="A6A6A6" w:sz="4"/>
+              <w:right w:val="single" w:color="A6A6A6" w:sz="4"/>
+            </w:tcBorders>
+            <w:tcMar>
+              <w:top w:type="dxa" w:w="60"/>
+              <w:left w:type="dxa" w:w="100"/>
+              <w:bottom w:type="dxa" w:w="60"/>
+              <w:right w:type="dxa" w:w="100"/>
+            </w:tcMar>
+          </w:tcPr>
+          <w:p>
+            <w:pPr>
+              <w:keepNext/>
+            </w:pPr>
+            <w:r>
+              <w:rPr>
+                <w:b w:val="false"/>
+                <w:bCs w:val="false"/>
+                <w:sz w:val="20"/>
+                <w:szCs w:val="20"/>
+              </w:rPr>
+              <w:t xml:space="preserve">0,89 / 5</w:t>
+            </w:r>
+          </w:p>
+        </w:tc>
+        <w:tc>
+          <w:tcPr>
+            <w:tcW w:type="dxa" w:w="2000"/>
+            <w:tcBorders>
+              <w:top w:val="single" w:color="A6A6A6" w:sz="4"/>
+              <w:left w:val="single" w:color="A6A6A6" w:sz="4"/>
+              <w:bottom w:val="single" w:color="A6A6A6" w:sz="4"/>
+              <w:right w:val="single" w:color="A6A6A6" w:sz="4"/>
+            </w:tcBorders>
+            <w:tcMar>
+              <w:top w:type="dxa" w:w="60"/>
+              <w:left w:type="dxa" w:w="100"/>
+              <w:bottom w:type="dxa" w:w="60"/>
+              <w:right w:type="dxa" w:w="100"/>
+            </w:tcMar>
+          </w:tcPr>
+          <w:p>
+            <w:pPr>
+              <w:keepNext/>
+            </w:pPr>
+            <w:r>
+              <w:rPr>
+                <w:b w:val="false"/>
+                <w:bCs w:val="false"/>
+                <w:sz w:val="20"/>
+                <w:szCs w:val="20"/>
+              </w:rPr>
+              <w:t xml:space="preserve">0,92 / 5</w:t>
+            </w:r>
+          </w:p>
+        </w:tc>
+        <w:tc>
+          <w:tcPr>
+            <w:tcW w:type="dxa" w:w="2000"/>
+            <w:tcBorders>
+              <w:top w:val="single" w:color="A6A6A6" w:sz="4"/>
+              <w:left w:val="single" w:color="A6A6A6" w:sz="4"/>
+              <w:bottom w:val="single" w:color="A6A6A6" w:sz="4"/>
+              <w:right w:val="single" w:color="A6A6A6" w:sz="4"/>
+            </w:tcBorders>
+            <w:tcMar>
+              <w:top w:type="dxa" w:w="60"/>
+              <w:left w:type="dxa" w:w="100"/>
+              <w:bottom w:type="dxa" w:w="60"/>
+              <w:right w:type="dxa" w:w="100"/>
+            </w:tcMar>
+          </w:tcPr>
+          <w:p>
+            <w:pPr>
+              <w:keepNext/>
+            </w:pPr>
+            <w:r>
+              <w:rPr>
+                <w:b w:val="false"/>
+                <w:bCs w:val="false"/>
+                <w:sz w:val="20"/>
+                <w:szCs w:val="20"/>
+              </w:rPr>
+              <w:t xml:space="preserve">0,80 / 5</w:t>
+            </w:r>
+          </w:p>
+        </w:tc>
+      </w:tr>
+      <w:tr>
+        <w:trPr>
+          <w:cantSplit/>
+        </w:trPr>
+        <w:tc>
+          <w:tcPr>
+            <w:tcW w:type="dxa" w:w="3026"/>
+            <w:tcBorders>
+              <w:top w:val="single" w:color="A6A6A6" w:sz="4"/>
+              <w:left w:val="single" w:color="A6A6A6" w:sz="4"/>
+              <w:bottom w:val="single" w:color="A6A6A6" w:sz="4"/>
+              <w:right w:val="single" w:color="A6A6A6" w:sz="4"/>
+            </w:tcBorders>
+            <w:tcMar>
+              <w:top w:type="dxa" w:w="60"/>
+              <w:left w:type="dxa" w:w="100"/>
+              <w:bottom w:type="dxa" w:w="60"/>
+              <w:right w:type="dxa" w:w="100"/>
+            </w:tcMar>
+          </w:tcPr>
+          <w:p>
+            <w:pPr>
+              <w:keepNext w:val="false"/>
+            </w:pPr>
+            <w:r>
+              <w:rPr>
+                <w:b w:val="false"/>
+                <w:bCs w:val="false"/>
+                <w:sz w:val="20"/>
+                <w:szCs w:val="20"/>
+              </w:rPr>
+              <w:t xml:space="preserve">WDBC, LRP-gamma</w:t>
+            </w:r>
+          </w:p>
+        </w:tc>
+        <w:tc>
+          <w:tcPr>
+            <w:tcW w:type="dxa" w:w="2000"/>
+            <w:tcBorders>
+              <w:top w:val="single" w:color="A6A6A6" w:sz="4"/>
+              <w:left w:val="single" w:color="A6A6A6" w:sz="4"/>
+              <w:bottom w:val="single" w:color="A6A6A6" w:sz="4"/>
+              <w:right w:val="single" w:color="A6A6A6" w:sz="4"/>
+            </w:tcBorders>
+            <w:tcMar>
+              <w:top w:type="dxa" w:w="60"/>
+              <w:left w:type="dxa" w:w="100"/>
+              <w:bottom w:type="dxa" w:w="60"/>
+              <w:right w:type="dxa" w:w="100"/>
+            </w:tcMar>
+          </w:tcPr>
+          <w:p>
+            <w:pPr>
+              <w:keepNext w:val="false"/>
+            </w:pPr>
+            <w:r>
+              <w:rPr>
+                <w:b w:val="false"/>
+                <w:bCs w:val="false"/>
+                <w:sz w:val="20"/>
+                <w:szCs w:val="20"/>
+              </w:rPr>
+              <w:t xml:space="preserve">0,89 / 5</w:t>
+            </w:r>
+          </w:p>
+        </w:tc>
+        <w:tc>
+          <w:tcPr>
+            <w:tcW w:type="dxa" w:w="2000"/>
+            <w:tcBorders>
+              <w:top w:val="single" w:color="A6A6A6" w:sz="4"/>
+              <w:left w:val="single" w:color="A6A6A6" w:sz="4"/>
+              <w:bottom w:val="single" w:color="A6A6A6" w:sz="4"/>
+              <w:right w:val="single" w:color="A6A6A6" w:sz="4"/>
+            </w:tcBorders>
+            <w:tcMar>
+              <w:top w:type="dxa" w:w="60"/>
+              <w:left w:type="dxa" w:w="100"/>
+              <w:bottom w:type="dxa" w:w="60"/>
+              <w:right w:type="dxa" w:w="100"/>
+            </w:tcMar>
+          </w:tcPr>
+          <w:p>
+            <w:pPr>
+              <w:keepNext w:val="false"/>
+            </w:pPr>
+            <w:r>
+              <w:rPr>
+                <w:b w:val="false"/>
+                <w:bCs w:val="false"/>
+                <w:sz w:val="20"/>
+                <w:szCs w:val="20"/>
+              </w:rPr>
+              <w:t xml:space="preserve">0,92 / 5</w:t>
+            </w:r>
+          </w:p>
+        </w:tc>
+        <w:tc>
+          <w:tcPr>
+            <w:tcW w:type="dxa" w:w="2000"/>
+            <w:tcBorders>
+              <w:top w:val="single" w:color="A6A6A6" w:sz="4"/>
+              <w:left w:val="single" w:color="A6A6A6" w:sz="4"/>
+              <w:bottom w:val="single" w:color="A6A6A6" w:sz="4"/>
+              <w:right w:val="single" w:color="A6A6A6" w:sz="4"/>
+            </w:tcBorders>
+            <w:tcMar>
+              <w:top w:type="dxa" w:w="60"/>
+              <w:left w:type="dxa" w:w="100"/>
+              <w:bottom w:type="dxa" w:w="60"/>
+              <w:right w:type="dxa" w:w="100"/>
+            </w:tcMar>
+          </w:tcPr>
+          <w:p>
+            <w:pPr>
+              <w:keepNext w:val="false"/>
+            </w:pPr>
+            <w:r>
+              <w:rPr>
+                <w:b w:val="false"/>
+                <w:bCs w:val="false"/>
+                <w:sz w:val="20"/>
+                <w:szCs w:val="20"/>
+              </w:rPr>
+              <w:t xml:space="preserve">0,80 / 5</w:t>
+            </w:r>
+          </w:p>
+        </w:tc>
+      </w:tr>
+    </w:tbl>
+    <w:p>
+      <w:pPr>
+        <w:spacing w:after="120"/>
+      </w:pPr>
     </w:p>
     <w:p>
       <w:pPr>
@@ -11073,7 +14075,7 @@
         <w:spacing w:after="80"/>
       </w:pPr>
       <w:r>
-        <w:t xml:space="preserve">Το XAI έγινε πάνω στα μοντέλα του πρώτου χωρισμού και όχι σε κάθε fold. Στο Coimbra το TabNet βγήκε ασταθές στο cross-validation, άρα οι εξηγήσεις του πρέπει να διαβαστούν με επιφύλαξη.</w:t>
+        <w:t xml:space="preserve">Coimbra: η Glucose και η Resistin είναι στις δύο πρώτες θέσεις του LRP (και στα δύο MLP) και στο top-3 και των πέντε τεχνικών του MLP. Το LRP συμφωνεί μέτρια με τις άλλες τεχνικές (ρ 0,52–0,75, 3 κοινά στο top-5). Η κύρια διαφορά είναι το BMI: το SHAP, το LIME και το permutation το βάζουν 3ο–4ο, ενώ και οι δύο κανόνες LRP το βάζουν 6ο, και ανεβάζουν τις Leptin και Adiponectin. Δεν μπορώ να πω ποια τεχνική έχει δίκιο.</w:t>
       </w:r>
     </w:p>
     <w:p>
@@ -11086,7 +14088,7 @@
         <w:spacing w:after="80"/>
       </w:pPr>
       <w:r>
-        <w:t xml:space="preserve">Στο SVM, το Accuracy στα scripts XAI και στο cross-validation υπολογίζεται με όριο 0,5 στις πιθανότητες (predict_proba), ενώ ο πίνακας του train_models.py χρησιμοποιεί predict(). Έτσι το SVM δίνει 75,0% και 70,8% στον ίδιο χωρισμό του Coimbra, με ίδιο ROC-AUC (0,797).</w:t>
+        <w:t xml:space="preserve">WDBC: και οι τέσσερις τεχνικές (LRP, SHAP, LIME, permutation) δίνουν για αυτό το MLP τα ίδια 5 χαρακτηριστικά (mean radius, worst smoothness, worst texture, worst perimeter, perimeter error), με ρ 0,80–0,92. Η συμφωνία είναι πολύ υψηλότερη από του Coimbra. Ταιριάζει με το CKA, όπου στο WDBC οι αναπαραστάσεις είναι πολύ πιο σταθερές ανάμεσα σε seeds, αλλά δεν έχω δοκιμάσει ότι υπάρχει σχέση αιτίας.</w:t>
       </w:r>
     </w:p>
     <w:p>
@@ -11099,7 +14101,7 @@
         <w:spacing w:after="80"/>
       </w:pPr>
       <w:r>
-        <w:t xml:space="preserve">Στο LIME έγινε μία εκτέλεση (random_state=42, 1000 δείγματα ανά εξήγηση), χωρίς μέτρηση διακύμανσης. Στο WDBC οι εξηγήσεις SHAP και LIME βασίζονται σε 40 από τα 114 δείγματα test.</w:t>
+        <w:t xml:space="preserve">Οι δύο κανόνες συμφωνούν μεταξύ τους στην κατάταξη (ρ 0,88 στο Coimbra, 1,00 στο WDBC). Οι απόλυτες τιμές του LRP-gamma είναι μεγαλύτερες (π.χ. Glucose 10,3 έναντι 3,3 στο Coimbra), άρα συγκρίνω τη σειρά και όχι τα μεγέθη.</w:t>
       </w:r>
     </w:p>
     <w:p>
@@ -11112,15 +14114,7 @@
         <w:spacing w:after="80"/>
       </w:pPr>
       <w:r>
-        <w:t xml:space="preserve">Στο XAI: το permutation importance υπολογίστηκε στο ίδιο test set και δεν έχω μετρήσει τη διακύμανσή του. Το SHAP στο WDBC βασίζεται σε 40 από τα 114 δείγματα. Και οι δύο τεχνικές δείχνουν σε τι βασίζεται το μοντέλο, όχι ότι το χαρακτηριστικό προκαλεί την ασθένεια. Με συσχετισμένα χαρακτηριστικά, οι σειρές κατάταξης δεν είναι αξιόπιστες.</w:t>
-      </w:r>
-    </w:p>
-    <w:p>
-      <w:pPr>
-        <w:pStyle w:val="Heading1"/>
-      </w:pPr>
-      <w:r>
-        <w:t xml:space="preserve">Συμπέρασμα</w:t>
+        <w:t xml:space="preserve">Το βαθύτερο MLP δίνει διαφορετική κατάταξη. Στο Coimbra, εκτός από τις Glucose και Resistin, το top-5 αλλάζει (LRP-epsilon: Leptin, Insulin, Age. LRP-gamma: BMI, Insulin, Leptin). Στο WDBC το MLP με δύο στρώματα έχει 4 από τα 5 χαρακτηριστικά κοινά με το MLP με ένα (worst texture, worst perimeter, worst smoothness, perimeter error), και το area error στη θέση του mean radius.</w:t>
       </w:r>
     </w:p>
     <w:p>
@@ -11133,7 +14127,15 @@
         <w:spacing w:after="80"/>
       </w:pPr>
       <w:r>
-        <w:t xml:space="preserve">Στο Coimbra (116 δείγματα) δεν μπορώ να ξεχωρίσω κανένα μοντέλο από τα άλλα. Με έναν χωρισμό το kNN ήταν πρώτο και το TabNet είχε το καλύτερο ROC-AUC. Στο cross-validation τα επτά από τα οκτώ μοντέλα απέχουν λιγότερο από μία απόκλιση, και το TabNet βγαίνει τελευταίο και ασταθές (67,1% ± 13,8%). Ο μέσος όρος του kNN είναι ο υψηλότερος (78,4%).</w:t>
+        <w:t xml:space="preserve">Η σημαντικότητα του LRP κλιμακώνεται με το logit της εξόδου. Σε δείγμα κοντά στο όριο απόφασης οι τιμές είναι μικρές και σε δείγμα όπου το μοντέλο είναι σίγουρο μεγάλες. Η καθολική σημαντικότητα (μέσος όρος των απόλυτων τιμών) επηρεάζεται λοιπόν περισσότερο από τα δείγματα όπου το μοντέλο είναι σίγουρο.</w:t>
+      </w:r>
+    </w:p>
+    <w:p>
+      <w:pPr>
+        <w:pStyle w:val="Heading1"/>
+      </w:pPr>
+      <w:r>
+        <w:t xml:space="preserve">Περιορισμοί που πρέπει να αναφέρω</w:t>
       </w:r>
     </w:p>
     <w:p>
@@ -11146,7 +14148,7 @@
         <w:spacing w:after="80"/>
       </w:pPr>
       <w:r>
-        <w:t xml:space="preserve">Στο WDBC (569 δείγματα) όλα τα μοντέλα έφτασαν 94%–98%. Το MLP (97,7%) και η απλή Logistic Regression (97,4%) είναι πρώτα, πρακτικά ισοδύναμα. Τα deep learning μοντέλα δεν έδειξαν πλεονέκτημα απέναντι στα κλασικά.</w:t>
+        <w:t xml:space="preserve">Στους πίνακες με έναν χωρισμό: οι ρυθμίσεις κάθε μοντέλου (sigma, αρχιτεκτονική MLP, bottleneck) επιλέχθηκαν με βάση την απόδοση στο ίδιο test set που αναφέρεται στα αποτελέσματα. Οι αριθμοί είναι λίγο αισιόδοξοι σε σχέση με μια καθαρή αξιολόγηση σε ξεχωριστά δεδομένα. Στο cross-validation η επιλογή γίνεται μέσα στα δεδομένα εκπαίδευσης, άρα αυτό το πρόβλημα λύνεται εκεί.</w:t>
       </w:r>
     </w:p>
     <w:p>
@@ -11159,7 +14161,7 @@
         <w:spacing w:after="80"/>
       </w:pPr>
       <w:r>
-        <w:t xml:space="preserve">Η βελτίωση από το Coimbra στο WDBC παρατηρείται και στα κλασικά μοντέλα, άρα οφείλεται στο dataset και όχι στα deep learning. Η αρχική μου ερμηνεία ότι τα deep learning χρειάζονται περισσότερα δεδομένα δεν υποστηρίζεται από το cross-validation.</w:t>
+        <w:t xml:space="preserve">Στο TabNet, το test set χρησιμοποιήθηκε και ως eval_set για το early stopping, και οι ρυθμίσεις του άλλαξαν μετά την αποτυχημένη πρώτη εκτέλεση. Το αποτέλεσμα του Coimbra πρέπει να διαβαστεί με αυτή την επιφύλαξη.</w:t>
       </w:r>
     </w:p>
     <w:p>
@@ -11172,7 +14174,7 @@
         <w:spacing w:after="80"/>
       </w:pPr>
       <w:r>
-        <w:t xml:space="preserve">XAI: στο Coimbra η Glucose και το BMI εμφανίζονται στο top-5 του SHAP και των 4 deep learning μοντέλων. Στο WDBC κυριαρχούν τα χαρακτηριστικά μεγέθους (perimeter, radius, area) και τα concave points. Οι τεχνικές δεν συμφωνούν πάντα: στο WDBC το attention του TabNet διαφωνεί με το SHAP και το permutation. Αυτά τα ευρήματα βασίζονται σε μοντέλα ενός χωρισμού.</w:t>
+        <w:t xml:space="preserve">Το test set του Coimbra έχει μόνο 24 δείγματα: ένα δείγμα διαφορά αλλάζει το Accuracy κατά περίπου 4 ποσοστιαίες μονάδες. Οι διαφορές της τάξης των 8 μονάδων ανάμεσα σε μοντέλα είναι αδύναμη ένδειξη.</w:t>
       </w:r>
     </w:p>
     <w:p>
@@ -11185,7 +14187,210 @@
         <w:spacing w:after="80"/>
       </w:pPr>
       <w:r>
+        <w:t xml:space="preserve">Στους πίνακες με έναν χωρισμό έγινε μία μόνο εκτέλεση ανά μοντέλο (random_state=42), χωρίς απόκλιση. Αυτό καλύπτεται από το cross-validation.</w:t>
+      </w:r>
+    </w:p>
+    <w:p>
+      <w:pPr>
+        <w:pStyle w:val="ListParagraph"/>
+        <w:numPr>
+          <w:ilvl w:val="0"/>
+          <w:numId w:val="2"/>
+        </w:numPr>
+        <w:spacing w:after="80"/>
+      </w:pPr>
+      <w:r>
+        <w:t xml:space="preserve">Στο cross-validation: το TabNet έχει σταθερές ρυθμίσεις που επέλεξα νωρίτερα βλέποντας το test του πρώτου χωρισμού, και στο Coimbra κάνει early stopping σε πολύ μικρό validation set. Τα κλασικά μοντέλα έτρεξαν χωρίς tuning. Έγινε μία μόνο επανάληψη 5-fold (ένα random_state), οπότε και οι μέσοι όροι έχουν κάποια αβεβαιότητα.</w:t>
+      </w:r>
+    </w:p>
+    <w:p>
+      <w:pPr>
+        <w:pStyle w:val="ListParagraph"/>
+        <w:numPr>
+          <w:ilvl w:val="0"/>
+          <w:numId w:val="2"/>
+        </w:numPr>
+        <w:spacing w:after="80"/>
+      </w:pPr>
+      <w:r>
+        <w:t xml:space="preserve">Το XAI έγινε πάνω στα μοντέλα του πρώτου χωρισμού και όχι σε κάθε fold. Στο Coimbra το TabNet βγήκε ασταθές στο cross-validation, άρα οι εξηγήσεις του πρέπει να διαβαστούν με επιφύλαξη.</w:t>
+      </w:r>
+    </w:p>
+    <w:p>
+      <w:pPr>
+        <w:pStyle w:val="ListParagraph"/>
+        <w:numPr>
+          <w:ilvl w:val="0"/>
+          <w:numId w:val="2"/>
+        </w:numPr>
+        <w:spacing w:after="80"/>
+      </w:pPr>
+      <w:r>
+        <w:t xml:space="preserve">Στο SVM, το Accuracy στα scripts XAI και στο cross-validation υπολογίζεται με όριο 0,5 στις πιθανότητες (predict_proba), ενώ ο πίνακας του train_models.py χρησιμοποιεί predict(). Έτσι το SVM δίνει 75,0% και 70,8% στον ίδιο χωρισμό του Coimbra, με ίδιο ROC-AUC (0,797).</w:t>
+      </w:r>
+    </w:p>
+    <w:p>
+      <w:pPr>
+        <w:pStyle w:val="ListParagraph"/>
+        <w:numPr>
+          <w:ilvl w:val="0"/>
+          <w:numId w:val="2"/>
+        </w:numPr>
+        <w:spacing w:after="80"/>
+      </w:pPr>
+      <w:r>
+        <w:t xml:space="preserve">Στο LIME έγινε μία εκτέλεση (random_state=42, 1000 δείγματα ανά εξήγηση), χωρίς μέτρηση διακύμανσης. Στο WDBC οι εξηγήσεις SHAP και LIME βασίζονται σε 40 από τα 114 δείγματα test.</w:t>
+      </w:r>
+    </w:p>
+    <w:p>
+      <w:pPr>
+        <w:pStyle w:val="ListParagraph"/>
+        <w:numPr>
+          <w:ilvl w:val="0"/>
+          <w:numId w:val="2"/>
+        </w:numPr>
+        <w:spacing w:after="80"/>
+      </w:pPr>
+      <w:r>
+        <w:t xml:space="preserve">Στο CKA: έγινε μία εκτέλεση ανά dataset, και ο υπολογισμός έγινε πάνω σε όλα τα δείγματα, και σε αυτά που είδε το μοντέλο στην εκπαίδευση. Το bottleneck (3–7 διαστάσεις) και το TabNet (4 διαστάσεις) έχουν λίγες διαστάσεις, και η έξοδος είναι μία διάσταση, όπου το γραμμικό CKA ισούται με το τετράγωνο της συσχέτισης. Το TabNet με early stopping σε validation set έδωσε στον έλεγχο Accuracy 0,875 στο Coimbra, αλλά αυτή η τιμή είναι μία εκτέλεση και δεν τη χρησιμοποιώ.</w:t>
+      </w:r>
+    </w:p>
+    <w:p>
+      <w:pPr>
+        <w:pStyle w:val="ListParagraph"/>
+        <w:numPr>
+          <w:ilvl w:val="0"/>
+          <w:numId w:val="2"/>
+        </w:numPr>
+        <w:spacing w:after="80"/>
+      </w:pPr>
+      <w:r>
+        <w:t xml:space="preserve">Στο LRP: έγινε μία εκτέλεση, μόνο στο MLP. Ο κανόνας gamma και η επιλογή του epsilon στο πρώτο στρώμα είναι δικές μου επιλογές. Το LRP εξηγεί μόνο το logit της κλάσης 1. Το bias απορροφά μέρος της σημαντικότητας, οπότε το άθροισμα των τιμών ανά δείγμα δεν ισούται ακριβώς με το logit. Οι τιμές βασίζονται σε 24 δείγματα (Coimbra) και 40 από τα 114 (WDBC). Το LRP-epsilon ταυτίζεται με το Gradient × Input.</w:t>
+      </w:r>
+    </w:p>
+    <w:p>
+      <w:pPr>
+        <w:pStyle w:val="ListParagraph"/>
+        <w:numPr>
+          <w:ilvl w:val="0"/>
+          <w:numId w:val="2"/>
+        </w:numPr>
+        <w:spacing w:after="80"/>
+      </w:pPr>
+      <w:r>
+        <w:t xml:space="preserve">Στο XAI: το permutation importance υπολογίστηκε στο ίδιο test set και δεν έχω μετρήσει τη διακύμανσή του. Το SHAP στο WDBC βασίζεται σε 40 από τα 114 δείγματα. Και οι δύο τεχνικές δείχνουν σε τι βασίζεται το μοντέλο, όχι ότι το χαρακτηριστικό προκαλεί την ασθένεια. Με συσχετισμένα χαρακτηριστικά, οι σειρές κατάταξης δεν είναι αξιόπιστες.</w:t>
+      </w:r>
+    </w:p>
+    <w:p>
+      <w:pPr>
+        <w:pStyle w:val="Heading1"/>
+      </w:pPr>
+      <w:r>
+        <w:t xml:space="preserve">Συμπέρασμα</w:t>
+      </w:r>
+    </w:p>
+    <w:p>
+      <w:pPr>
+        <w:pStyle w:val="ListParagraph"/>
+        <w:numPr>
+          <w:ilvl w:val="0"/>
+          <w:numId w:val="2"/>
+        </w:numPr>
+        <w:spacing w:after="80"/>
+      </w:pPr>
+      <w:r>
+        <w:t xml:space="preserve">Στο Coimbra (116 δείγματα) δεν μπορώ να ξεχωρίσω κανένα μοντέλο από τα άλλα. Με έναν χωρισμό το kNN ήταν πρώτο και το TabNet είχε το καλύτερο ROC-AUC. Στο cross-validation τα επτά από τα οκτώ μοντέλα απέχουν λιγότερο από μία απόκλιση, και το TabNet βγαίνει τελευταίο και ασταθές (67,1% ± 13,8%). Ο μέσος όρος του kNN είναι ο υψηλότερος (78,4%).</w:t>
+      </w:r>
+    </w:p>
+    <w:p>
+      <w:pPr>
+        <w:pStyle w:val="ListParagraph"/>
+        <w:numPr>
+          <w:ilvl w:val="0"/>
+          <w:numId w:val="2"/>
+        </w:numPr>
+        <w:spacing w:after="80"/>
+      </w:pPr>
+      <w:r>
+        <w:t xml:space="preserve">Στο WDBC (569 δείγματα) όλα τα μοντέλα έφτασαν 94%–98%. Το MLP (97,7%) και η απλή Logistic Regression (97,4%) είναι πρώτα, πρακτικά ισοδύναμα. Τα deep learning μοντέλα δεν έδειξαν πλεονέκτημα απέναντι στα κλασικά.</w:t>
+      </w:r>
+    </w:p>
+    <w:p>
+      <w:pPr>
+        <w:pStyle w:val="ListParagraph"/>
+        <w:numPr>
+          <w:ilvl w:val="0"/>
+          <w:numId w:val="2"/>
+        </w:numPr>
+        <w:spacing w:after="80"/>
+      </w:pPr>
+      <w:r>
+        <w:t xml:space="preserve">Η βελτίωση από το Coimbra στο WDBC παρατηρείται και στα κλασικά μοντέλα, άρα οφείλεται στο dataset και όχι στα deep learning. Η αρχική μου ερμηνεία ότι τα deep learning χρειάζονται περισσότερα δεδομένα δεν υποστηρίζεται από το cross-validation.</w:t>
+      </w:r>
+    </w:p>
+    <w:p>
+      <w:pPr>
+        <w:pStyle w:val="ListParagraph"/>
+        <w:numPr>
+          <w:ilvl w:val="0"/>
+          <w:numId w:val="2"/>
+        </w:numPr>
+        <w:spacing w:after="80"/>
+      </w:pPr>
+      <w:r>
+        <w:t xml:space="preserve">XAI: στο Coimbra η Glucose και το BMI εμφανίζονται στο top-5 του SHAP και των 4 deep learning μοντέλων. Στο WDBC κυριαρχούν τα χαρακτηριστικά μεγέθους (perimeter, radius, area) και τα concave points. Οι τεχνικές δεν συμφωνούν πάντα: στο WDBC το attention του TabNet διαφωνεί με το SHAP και το permutation. Αυτά τα ευρήματα βασίζονται σε μοντέλα ενός χωρισμού.</w:t>
+      </w:r>
+    </w:p>
+    <w:p>
+      <w:pPr>
+        <w:pStyle w:val="ListParagraph"/>
+        <w:numPr>
+          <w:ilvl w:val="0"/>
+          <w:numId w:val="2"/>
+        </w:numPr>
+        <w:spacing w:after="80"/>
+      </w:pPr>
+      <w:r>
         <w:t xml:space="preserve">Σύγκριση τεχνικών XAI στα 8 μοντέλα: το SHAP και το LIME συμφωνούν συνήθως μεταξύ τους (ρ 0,68–0,95), ενώ το permutation συμφωνεί λιγότερο, κυρίως στα kNN, GRNN και RUSBoost του WDBC. Η Glucose, η Resistin και το BMI (Coimbra) και τα χαρακτηριστικά μεγέθους, το worst texture και το worst concave points (WDBC) εμφανίζονται σταθερά στα top-5 των περισσότερων μοντέλων και τεχνικών. Η σειρά μέσα στο top-5 αλλάζει από τεχνική σε τεχνική, άρα δεν τη θεωρώ αξιόπιστη.</w:t>
+      </w:r>
+    </w:p>
+    <w:p>
+      <w:pPr>
+        <w:pStyle w:val="ListParagraph"/>
+        <w:numPr>
+          <w:ilvl w:val="0"/>
+          <w:numId w:val="2"/>
+        </w:numPr>
+        <w:spacing w:after="80"/>
+      </w:pPr>
+      <w:r>
+        <w:t xml:space="preserve">CKA: ακόμη και η ίδια αρχιτεκτονική δίνει διαφορετικές αναπαραστάσεις στο μικρό dataset (CKA 0,67–0,91 ανάμεσα σε seeds), ενώ στο μεγάλο είναι σχεδόν ίδιες (0,96–0,98). Στο WDBC το δεύτερο κρυφό στρώμα του MLP δεν προσθέτει νέα γεωμετρία (0,99). Το TabNet φτιάχνει αναπαραστάσεις που απέχουν από των MLP και Autoencoder, ενώ οι έξοδοι του MLP και του TabNet ταιριάζουν (0,77–0,83).</w:t>
+      </w:r>
+    </w:p>
+    <w:p>
+      <w:pPr>
+        <w:pStyle w:val="ListParagraph"/>
+        <w:numPr>
+          <w:ilvl w:val="0"/>
+          <w:numId w:val="2"/>
+        </w:numPr>
+        <w:spacing w:after="80"/>
+      </w:pPr>
+      <w:r>
+        <w:t xml:space="preserve">LRP (MLP): η Glucose και η Resistin είναι πρώτες και στο Coimbra, όπως και στις άλλες τεχνικές, ενώ το BMI παίρνει χαμηλότερη θέση από ό,τι στο SHAP, LIME και permutation. Στο WDBC και οι τέσσερις τεχνικές δίνουν τα ίδια 5 χαρακτηριστικά για το MLP. Οι κανόνες epsilon και gamma συμφωνούν στην κατάταξη, και το LRP-epsilon ταυτίζεται με το Gradient × Input.</w:t>
+      </w:r>
+    </w:p>
+    <w:p>
+      <w:pPr>
+        <w:pStyle w:val="ListParagraph"/>
+        <w:numPr>
+          <w:ilvl w:val="0"/>
+          <w:numId w:val="2"/>
+        </w:numPr>
+        <w:spacing w:after="80"/>
+      </w:pPr>
+      <w:r>
+        <w:t xml:space="preserve">Επόμενο βήμα που ζήτησε ο επιβλέπων: εκτέλεση του κώδικα σε Google Colab.</w:t>
       </w:r>
     </w:p>
     <w:p>

</xml_diff>